<commit_message>
ISO W10 sapuan SOP ISMS: ISMS-SOP-02, 03, 04, 05
Co-Authored-By: Claude Opus 5.5 <noreply@anthropic.com>
Claude-Session: https://claude.ai/code/session_01BhkCQM7h3krZb9kjY2Nate
</commit_message>
<xml_diff>
--- a/out/08_ISMS/SNX-ISMS-SOP-02 User Access Control & Authorization (Rev00 DRAFT).docx
+++ b/out/08_ISMS/SNX-ISMS-SOP-02 User Access Control & Authorization (Rev00 DRAFT).docx
@@ -217,6 +217,7 @@
     <w:p>
       <w:pPr>
         <w:pStyle w:val="Heading1"/>
+        <w:keepNext/>
         <w:widowControl w:val="0"/>
         <w:spacing w:line="240" w:lineRule="auto"/>
         <w:ind w:right="407" w:firstLine="0"/>
@@ -511,6 +512,10 @@
         <w:gridCol w:w="5850"/>
       </w:tblGrid>
       <w:tr>
+        <w:trPr>
+          <w:cantSplit/>
+          <w:tblHeader/>
+        </w:trPr>
         <w:tc>
           <w:tcPr>
             <w:tcW w:w="3150" w:type="dxa"/>
@@ -523,6 +528,7 @@
           </w:tcPr>
           <w:p>
             <w:pPr>
+              <w:keepNext/>
               <w:widowControl w:val="0"/>
               <w:pBdr>
                 <w:top w:val="nil"/>
@@ -563,6 +569,7 @@
           </w:tcPr>
           <w:p>
             <w:pPr>
+              <w:keepNext/>
               <w:widowControl w:val="0"/>
               <w:pBdr>
                 <w:top w:val="nil"/>
@@ -593,6 +600,9 @@
         </w:tc>
       </w:tr>
       <w:tr>
+        <w:trPr>
+          <w:cantSplit/>
+        </w:trPr>
         <w:tc>
           <w:tcPr>
             <w:tcW w:w="3150" w:type="dxa"/>
@@ -646,6 +656,9 @@
         </w:tc>
       </w:tr>
       <w:tr>
+        <w:trPr>
+          <w:cantSplit/>
+        </w:trPr>
         <w:tc>
           <w:tcPr>
             <w:tcW w:w="3150" w:type="dxa"/>
@@ -699,6 +712,9 @@
         </w:tc>
       </w:tr>
       <w:tr>
+        <w:trPr>
+          <w:cantSplit/>
+        </w:trPr>
         <w:tc>
           <w:tcPr>
             <w:tcW w:w="3150" w:type="dxa"/>
@@ -750,6 +766,9 @@
         </w:tc>
       </w:tr>
       <w:tr>
+        <w:trPr>
+          <w:cantSplit/>
+        </w:trPr>
         <w:tc>
           <w:tcPr>
             <w:tcW w:w="3150" w:type="dxa"/>
@@ -810,6 +829,9 @@
         </w:tc>
       </w:tr>
       <w:tr>
+        <w:trPr>
+          <w:cantSplit/>
+        </w:trPr>
         <w:tc>
           <w:tcPr>
             <w:tcW w:w="3150" w:type="dxa"/>
@@ -861,6 +883,9 @@
         </w:tc>
       </w:tr>
       <w:tr>
+        <w:trPr>
+          <w:cantSplit/>
+        </w:trPr>
         <w:tc>
           <w:tcPr>
             <w:tcW w:w="3150" w:type="dxa"/>
@@ -914,6 +939,9 @@
         </w:tc>
       </w:tr>
       <w:tr>
+        <w:trPr>
+          <w:cantSplit/>
+        </w:trPr>
         <w:tc>
           <w:tcPr>
             <w:tcW w:w="3150" w:type="dxa"/>
@@ -967,6 +995,9 @@
         </w:tc>
       </w:tr>
       <w:tr>
+        <w:trPr>
+          <w:cantSplit/>
+        </w:trPr>
         <w:tc>
           <w:tcPr>
             <w:tcW w:w="3150" w:type="dxa"/>
@@ -1020,6 +1051,9 @@
         </w:tc>
       </w:tr>
       <w:tr>
+        <w:trPr>
+          <w:cantSplit/>
+        </w:trPr>
         <w:tc>
           <w:tcPr>
             <w:tcW w:w="3150" w:type="dxa"/>
@@ -1073,6 +1107,9 @@
         </w:tc>
       </w:tr>
       <w:tr>
+        <w:trPr>
+          <w:cantSplit/>
+        </w:trPr>
         <w:tc>
           <w:tcPr>
             <w:tcW w:w="3150" w:type="dxa"/>
@@ -1126,6 +1163,9 @@
         </w:tc>
       </w:tr>
       <w:tr>
+        <w:trPr>
+          <w:cantSplit/>
+        </w:trPr>
         <w:tc>
           <w:tcPr>
             <w:tcW w:w="3150" w:type="dxa"/>
@@ -1207,6 +1247,7 @@
     <w:p>
       <w:pPr>
         <w:pStyle w:val="Heading1"/>
+        <w:keepNext/>
         <w:widowControl w:val="0"/>
         <w:spacing w:before="816" w:line="240" w:lineRule="auto"/>
         <w:ind w:right="407"/>
@@ -1243,6 +1284,10 @@
         <w:gridCol w:w="3010"/>
       </w:tblGrid>
       <w:tr>
+        <w:trPr>
+          <w:cantSplit/>
+          <w:tblHeader/>
+        </w:trPr>
         <w:tc>
           <w:tcPr>
             <w:tcW w:w="3009" w:type="dxa"/>
@@ -1255,6 +1300,7 @@
           </w:tcPr>
           <w:p>
             <w:pPr>
+              <w:keepNext/>
               <w:widowControl w:val="0"/>
               <w:spacing w:line="240" w:lineRule="auto"/>
               <w:jc w:val="center"/>
@@ -1288,6 +1334,7 @@
           </w:tcPr>
           <w:p>
             <w:pPr>
+              <w:keepNext/>
               <w:widowControl w:val="0"/>
               <w:spacing w:line="240" w:lineRule="auto"/>
               <w:jc w:val="center"/>
@@ -1321,6 +1368,7 @@
           </w:tcPr>
           <w:p>
             <w:pPr>
+              <w:keepNext/>
               <w:widowControl w:val="0"/>
               <w:spacing w:line="240" w:lineRule="auto"/>
               <w:jc w:val="center"/>
@@ -1344,6 +1392,9 @@
         </w:tc>
       </w:tr>
       <w:tr>
+        <w:trPr>
+          <w:cantSplit/>
+        </w:trPr>
         <w:tc>
           <w:tcPr>
             <w:tcW w:w="3009" w:type="dxa"/>
@@ -1392,6 +1443,9 @@
         </w:tc>
       </w:tr>
       <w:tr>
+        <w:trPr>
+          <w:cantSplit/>
+        </w:trPr>
         <w:tc>
           <w:tcPr>
             <w:tcW w:w="3009" w:type="dxa"/>
@@ -1463,6 +1517,9 @@
         </w:tc>
       </w:tr>
       <w:tr>
+        <w:trPr>
+          <w:cantSplit/>
+        </w:trPr>
         <w:tc>
           <w:tcPr>
             <w:tcW w:w="3009" w:type="dxa"/>
@@ -1537,6 +1594,7 @@
     <w:p>
       <w:pPr>
         <w:pStyle w:val="Heading1"/>
+        <w:keepNext/>
         <w:widowControl w:val="0"/>
         <w:spacing w:before="816" w:line="240" w:lineRule="auto"/>
         <w:ind w:right="407"/>
@@ -1578,6 +1636,10 @@
         <w:gridCol w:w="2235"/>
       </w:tblGrid>
       <w:tr>
+        <w:trPr>
+          <w:cantSplit/>
+          <w:tblHeader/>
+        </w:trPr>
         <w:tc>
           <w:tcPr>
             <w:tcW w:w="810" w:type="dxa"/>
@@ -1590,6 +1652,7 @@
           </w:tcPr>
           <w:p>
             <w:pPr>
+              <w:keepNext/>
               <w:widowControl w:val="0"/>
               <w:pBdr>
                 <w:top w:val="nil"/>
@@ -1630,6 +1693,7 @@
           </w:tcPr>
           <w:p>
             <w:pPr>
+              <w:keepNext/>
               <w:widowControl w:val="0"/>
               <w:spacing w:line="240" w:lineRule="auto"/>
               <w:jc w:val="center"/>
@@ -1663,6 +1727,7 @@
           </w:tcPr>
           <w:p>
             <w:pPr>
+              <w:keepNext/>
               <w:widowControl w:val="0"/>
               <w:pBdr>
                 <w:top w:val="nil"/>
@@ -1703,6 +1768,7 @@
           </w:tcPr>
           <w:p>
             <w:pPr>
+              <w:keepNext/>
               <w:widowControl w:val="0"/>
               <w:pBdr>
                 <w:top w:val="nil"/>
@@ -1733,6 +1799,9 @@
         </w:tc>
       </w:tr>
       <w:tr>
+        <w:trPr>
+          <w:cantSplit/>
+        </w:trPr>
         <w:tc>
           <w:tcPr>
             <w:tcW w:w="810" w:type="dxa"/>
@@ -1835,6 +1904,9 @@
         </w:tc>
       </w:tr>
       <w:tr>
+        <w:trPr>
+          <w:cantSplit/>
+        </w:trPr>
         <w:tc>
           <w:tcPr>
             <w:tcW w:w="810" w:type="dxa"/>
@@ -1937,6 +2009,9 @@
         </w:tc>
       </w:tr>
       <w:tr>
+        <w:trPr>
+          <w:cantSplit/>
+        </w:trPr>
         <w:tc>
           <w:tcPr>
             <w:tcW w:w="810" w:type="dxa"/>
@@ -2400,7 +2475,7 @@
           <w:sz w:val="24"/>
           <w:szCs w:val="24"/>
         </w:rPr>
-        <w:t xml:space="preserve">SOP ini mengatur pemberian, perubahan, peninjauan, dan pencabutan hak akses ke sistem SINUX dan sistem pelanggan yang dikelola SINUX, berdasarkan prinsip least privilege dan need-to-know, agar hanya orang yang berwenang yang dapat mengakses informasi dan sistem.</w:t>
+        <w:t xml:space="preserve">SOP ini mengatur pemberian, perubahan, review, dan pencabutan hak akses ke sistem SINUX dan sistem pelanggan yang dikelola SINUX. Prinsip yang dipakai adalah least privilege dan need-to-know, sehingga hanya orang yang berwenang yang dapat mengakses informasi dan sistem.</w:t>
       </w:r>
     </w:p>
     <w:p>
@@ -2463,7 +2538,7 @@
           <w:sz w:val="24"/>
           <w:szCs w:val="24"/>
         </w:rPr>
-        <w:t xml:space="preserve">Sistem internal: email dan Drive, sistem tiket (Zammad dan Service Hub GLPI), knowledge base, password manager, Jumphost, monitoring (Nusametric dan Overseer), SIEM, console Nusagrid, Acronis, Cloudflare, dan AegisWAF.</w:t>
+        <w:t xml:space="preserve">Sistem internal: email dan Drive, sistem ticket (Zammad dan Service Hub GLPI), knowledge base, password manager, Jumphost, monitoring (Nusametric dan Overseer), SIEM, console Nusagrid, Acronis, Cloudflare, dan AegisWAF.</w:t>
       </w:r>
     </w:p>
     <w:p>
@@ -2493,6 +2568,7 @@
     <w:p>
       <w:pPr>
         <w:pStyle w:val="Heading1"/>
+        <w:keepNext/>
         <w:numPr>
           <w:ilvl w:val="0"/>
           <w:numId w:val="7"/>
@@ -2527,6 +2603,8 @@
       </w:tblGrid>
       <w:tr>
         <w:trPr>
+          <w:cantSplit/>
+          <w:tblHeader/>
           <w:jc w:val="center"/>
         </w:trPr>
         <w:tc>
@@ -2536,6 +2614,7 @@
           </w:tcPr>
           <w:p>
             <w:pPr>
+              <w:keepNext/>
               <w:jc w:val="center"/>
               <w:rPr>
                 <w:sz w:val="24"/>
@@ -2560,6 +2639,7 @@
           </w:tcPr>
           <w:p>
             <w:pPr>
+              <w:keepNext/>
               <w:jc w:val="center"/>
               <w:rPr>
                 <w:sz w:val="24"/>
@@ -2580,6 +2660,7 @@
       </w:tr>
       <w:tr>
         <w:trPr>
+          <w:cantSplit/>
           <w:jc w:val="center"/>
         </w:trPr>
         <w:tc>
@@ -2629,6 +2710,7 @@
       </w:tr>
       <w:tr>
         <w:trPr>
+          <w:cantSplit/>
           <w:jc w:val="center"/>
         </w:trPr>
         <w:tc>
@@ -2678,6 +2760,7 @@
       </w:tr>
       <w:tr>
         <w:trPr>
+          <w:cantSplit/>
           <w:jc w:val="center"/>
         </w:trPr>
         <w:tc>
@@ -2727,6 +2810,7 @@
       </w:tr>
       <w:tr>
         <w:trPr>
+          <w:cantSplit/>
           <w:jc w:val="center"/>
         </w:trPr>
         <w:tc>
@@ -2769,13 +2853,14 @@
                 <w:sz w:val="24"/>
                 <w:szCs w:val="24"/>
               </w:rPr>
-              <w:t>Jalur masuk SINUX ke production pelanggan yang merekam sesi.</w:t>
+              <w:t>Jalur masuk SINUX ke production pelanggan, dengan setiap sesi terekam.</w:t>
             </w:r>
           </w:p>
         </w:tc>
       </w:tr>
       <w:tr>
         <w:trPr>
+          <w:cantSplit/>
           <w:jc w:val="center"/>
         </w:trPr>
         <w:tc>
@@ -2825,6 +2910,7 @@
       </w:tr>
       <w:tr>
         <w:trPr>
+          <w:cantSplit/>
           <w:jc w:val="center"/>
         </w:trPr>
         <w:tc>
@@ -2874,6 +2960,7 @@
       </w:tr>
       <w:tr>
         <w:trPr>
+          <w:cantSplit/>
           <w:jc w:val="center"/>
         </w:trPr>
         <w:tc>
@@ -2923,6 +3010,7 @@
       </w:tr>
       <w:tr>
         <w:trPr>
+          <w:cantSplit/>
           <w:jc w:val="center"/>
         </w:trPr>
         <w:tc>
@@ -2972,6 +3060,7 @@
       </w:tr>
       <w:tr>
         <w:trPr>
+          <w:cantSplit/>
           <w:jc w:val="center"/>
         </w:trPr>
         <w:tc>
@@ -3021,6 +3110,7 @@
       </w:tr>
       <w:tr>
         <w:trPr>
+          <w:cantSplit/>
           <w:jc w:val="center"/>
         </w:trPr>
         <w:tc>
@@ -3070,6 +3160,7 @@
       </w:tr>
       <w:tr>
         <w:trPr>
+          <w:cantSplit/>
           <w:jc w:val="center"/>
         </w:trPr>
         <w:tc>
@@ -3119,6 +3210,7 @@
       </w:tr>
       <w:tr>
         <w:trPr>
+          <w:cantSplit/>
           <w:jc w:val="center"/>
         </w:trPr>
         <w:tc>
@@ -3168,6 +3260,7 @@
       </w:tr>
       <w:tr>
         <w:trPr>
+          <w:cantSplit/>
           <w:jc w:val="center"/>
         </w:trPr>
         <w:tc>
@@ -3217,6 +3310,7 @@
       </w:tr>
       <w:tr>
         <w:trPr>
+          <w:cantSplit/>
           <w:jc w:val="center"/>
         </w:trPr>
         <w:tc>
@@ -3266,6 +3360,7 @@
       </w:tr>
       <w:tr>
         <w:trPr>
+          <w:cantSplit/>
           <w:jc w:val="center"/>
         </w:trPr>
         <w:tc>
@@ -3308,13 +3403,14 @@
                 <w:sz w:val="24"/>
                 <w:szCs w:val="24"/>
               </w:rPr>
-              <w:t>SINUX Service Hub berbasis GLPI, sistem tiket untuk generalist, termasuk permintaan internal.</w:t>
+              <w:t>SINUX Service Hub berbasis GLPI, sistem ticket untuk generalist, termasuk permintaan internal.</w:t>
             </w:r>
           </w:p>
         </w:tc>
       </w:tr>
       <w:tr>
         <w:trPr>
+          <w:cantSplit/>
           <w:jc w:val="center"/>
         </w:trPr>
         <w:tc>
@@ -3364,6 +3460,7 @@
       </w:tr>
       <w:tr>
         <w:trPr>
+          <w:cantSplit/>
           <w:jc w:val="center"/>
         </w:trPr>
         <w:tc>
@@ -3406,7 +3503,7 @@
                 <w:sz w:val="24"/>
                 <w:szCs w:val="24"/>
               </w:rPr>
-              <w:t>Sistem tiket untuk Ops.</w:t>
+              <w:t>Sistem ticket untuk Ops.</w:t>
             </w:r>
           </w:p>
         </w:tc>
@@ -3560,7 +3657,7 @@
           <w:sz w:val="24"/>
           <w:szCs w:val="24"/>
         </w:rPr>
-        <w:t xml:space="preserve">Akses privileged (Annex A 8.2) diberikan terpisah dari akun harian dan hanya melalui Jumphost bila sistem mendukung.</w:t>
+        <w:t xml:space="preserve">Akses privileged (Annex A 8.2) diberikan terpisah dari akun harian, dan hanya melalui Jumphost jika sistem mendukung.</w:t>
       </w:r>
     </w:p>
     <w:p>
@@ -3704,7 +3801,7 @@
           <w:sz w:val="24"/>
           <w:szCs w:val="24"/>
         </w:rPr>
-        <w:t xml:space="preserve">Tingkat akses acuan per peran berikut adalah acuan awal (USULAN).</w:t>
+        <w:t xml:space="preserve">Tingkat akses per peran berikut adalah acuan awal (USULAN).</w:t>
       </w:r>
     </w:p>
     <w:p>
@@ -3728,7 +3825,7 @@
           <w:sz w:val="24"/>
           <w:szCs w:val="24"/>
         </w:rPr>
-        <w:t xml:space="preserve">NOC Engineer: sistem tiket Agent; monitoring read-only dan acknowledge alert; SIEM dan WAF read-only; console Nusagrid Operator; Acronis Operator; Jumphost sesuai aset yang ditugaskan; password manager collection tim sendiri; knowledge base sesuai peran tech-ops.</w:t>
+        <w:t xml:space="preserve">NOC Engineer: sistem ticket Agent; monitoring read-only dan acknowledge alert; SIEM dan WAF read-only; console Nusagrid Operator; Acronis Operator; Jumphost sesuai aset yang ditugaskan; password manager collection tim sendiri; knowledge base sesuai peran tech-ops.</w:t>
       </w:r>
     </w:p>
     <w:p>
@@ -3752,7 +3849,7 @@
           <w:sz w:val="24"/>
           <w:szCs w:val="24"/>
         </w:rPr>
-        <w:t xml:space="preserve">SOC Analyst: sistem tiket Agent; monitoring read-only; SIEM dan WAF Analyst; console Nusagrid read-only; Acronis read-only; Jumphost sesuai investigasi; password manager collection tim sendiri; knowledge base sesuai peran tech-ops.</w:t>
+        <w:t xml:space="preserve">SOC Analyst: sistem ticket Agent; monitoring read-only; SIEM dan WAF Analyst; console Nusagrid read-only; Acronis read-only; Jumphost sesuai investigasi; password manager collection tim sendiri; knowledge base sesuai peran tech-ops.</w:t>
       </w:r>
     </w:p>
     <w:p>
@@ -3776,7 +3873,7 @@
           <w:sz w:val="24"/>
           <w:szCs w:val="24"/>
         </w:rPr>
-        <w:t xml:space="preserve">Lead NOC dan Lead SOC: sistem tiket Group admin; monitoring Admin; SIEM dan WAF Admin; console Nusagrid Admin; Acronis Admin; Jumphost sesuai kebutuhan; password manager collection manager; knowledge base sesuai peran.</w:t>
+        <w:t xml:space="preserve">Lead NOC dan Lead SOC: sistem ticket Group admin; monitoring Admin; SIEM dan WAF Admin; console Nusagrid Admin; Acronis Admin; Jumphost sesuai kebutuhan; password manager collection manager; knowledge base sesuai peran.</w:t>
       </w:r>
     </w:p>
     <w:p>
@@ -3800,7 +3897,7 @@
           <w:sz w:val="24"/>
           <w:szCs w:val="24"/>
         </w:rPr>
-        <w:t xml:space="preserve">SD dan PM: sistem tiket Agent; monitoring read-only; SIEM dan WAF tidak ada akses; console Nusagrid read-only; Acronis tidak ada akses; Jumphost tidak ada akses; password manager collection proyek; knowledge base sesuai peran.</w:t>
+        <w:t xml:space="preserve">SD dan PM: sistem ticket Agent; monitoring read-only; SIEM dan WAF tidak ada akses; console Nusagrid read-only; Acronis tidak ada akses; Jumphost tidak ada akses; password manager collection proyek; knowledge base sesuai peran.</w:t>
       </w:r>
     </w:p>
     <w:p>
@@ -3824,12 +3921,13 @@
           <w:sz w:val="24"/>
           <w:szCs w:val="24"/>
         </w:rPr>
-        <w:t xml:space="preserve">Perubahan rule SIEM dan WAF melalui SNX-OPS-SOP-02. Restore production di Acronis butuh approval Lead NOC atau Lead SOC. Di knowledge base, data di luar scope tidak tampil.</w:t>
+        <w:t xml:space="preserve">Perubahan rule SIEM dan WAF dilakukan melalui SNX-OPS-SOP-02. Restore production di Acronis memerlukan approval Lead NOC atau Lead SOC. Di knowledge base, data di luar scope tidak tampil.</w:t>
       </w:r>
     </w:p>
     <w:p>
       <w:pPr>
         <w:pStyle w:val="Heading1"/>
+        <w:keepNext/>
         <w:numPr>
           <w:ilvl w:val="0"/>
           <w:numId w:val="7"/>
@@ -3857,6 +3955,8 @@
       </w:tblGrid>
       <w:tr>
         <w:trPr>
+          <w:cantSplit/>
+          <w:tblHeader/>
           <w:jc w:val="center"/>
         </w:trPr>
         <w:tc>
@@ -3873,6 +3973,7 @@
           </w:tcPr>
           <w:p>
             <w:pPr>
+              <w:keepNext/>
               <w:jc w:val="center"/>
               <w:rPr>
                 <w:sz w:val="24"/>
@@ -3904,6 +4005,7 @@
           </w:tcPr>
           <w:p>
             <w:pPr>
+              <w:keepNext/>
               <w:jc w:val="center"/>
               <w:rPr>
                 <w:sz w:val="24"/>
@@ -3935,6 +4037,7 @@
           </w:tcPr>
           <w:p>
             <w:pPr>
+              <w:keepNext/>
               <w:jc w:val="center"/>
               <w:rPr>
                 <w:sz w:val="24"/>
@@ -3955,6 +4058,7 @@
       </w:tr>
       <w:tr>
         <w:trPr>
+          <w:cantSplit/>
           <w:jc w:val="center"/>
         </w:trPr>
         <w:tc>
@@ -4000,7 +4104,7 @@
           </w:tcPr>
           <w:p>
             <w:pPr>
-              <w:jc w:val="both"/>
+              <w:jc w:val="left"/>
               <w:rPr>
                 <w:sz w:val="24"/>
                 <w:szCs w:val="24"/>
@@ -4030,7 +4134,7 @@
           </w:tcPr>
           <w:p>
             <w:pPr>
-              <w:jc w:val="both"/>
+              <w:jc w:val="left"/>
               <w:rPr>
                 <w:sz w:val="24"/>
                 <w:szCs w:val="24"/>
@@ -4049,6 +4153,7 @@
       </w:tr>
       <w:tr>
         <w:trPr>
+          <w:cantSplit/>
           <w:jc w:val="center"/>
         </w:trPr>
         <w:tc>
@@ -4094,7 +4199,7 @@
           </w:tcPr>
           <w:p>
             <w:pPr>
-              <w:jc w:val="both"/>
+              <w:jc w:val="left"/>
               <w:rPr>
                 <w:sz w:val="24"/>
                 <w:szCs w:val="24"/>
@@ -4124,7 +4229,7 @@
           </w:tcPr>
           <w:p>
             <w:pPr>
-              <w:jc w:val="both"/>
+              <w:jc w:val="left"/>
               <w:rPr>
                 <w:sz w:val="24"/>
                 <w:szCs w:val="24"/>
@@ -4143,6 +4248,7 @@
       </w:tr>
       <w:tr>
         <w:trPr>
+          <w:cantSplit/>
           <w:jc w:val="center"/>
         </w:trPr>
         <w:tc>
@@ -4188,7 +4294,7 @@
           </w:tcPr>
           <w:p>
             <w:pPr>
-              <w:jc w:val="both"/>
+              <w:jc w:val="left"/>
               <w:rPr>
                 <w:sz w:val="24"/>
                 <w:szCs w:val="24"/>
@@ -4218,7 +4324,7 @@
           </w:tcPr>
           <w:p>
             <w:pPr>
-              <w:jc w:val="both"/>
+              <w:jc w:val="left"/>
               <w:rPr>
                 <w:sz w:val="24"/>
                 <w:szCs w:val="24"/>
@@ -4237,6 +4343,7 @@
       </w:tr>
       <w:tr>
         <w:trPr>
+          <w:cantSplit/>
           <w:jc w:val="center"/>
         </w:trPr>
         <w:tc>
@@ -4282,7 +4389,7 @@
           </w:tcPr>
           <w:p>
             <w:pPr>
-              <w:jc w:val="both"/>
+              <w:jc w:val="left"/>
               <w:rPr>
                 <w:sz w:val="24"/>
                 <w:szCs w:val="24"/>
@@ -4312,7 +4419,7 @@
           </w:tcPr>
           <w:p>
             <w:pPr>
-              <w:jc w:val="both"/>
+              <w:jc w:val="left"/>
               <w:rPr>
                 <w:sz w:val="24"/>
                 <w:szCs w:val="24"/>
@@ -4331,6 +4438,7 @@
       </w:tr>
       <w:tr>
         <w:trPr>
+          <w:cantSplit/>
           <w:jc w:val="center"/>
         </w:trPr>
         <w:tc>
@@ -4376,7 +4484,7 @@
           </w:tcPr>
           <w:p>
             <w:pPr>
-              <w:jc w:val="both"/>
+              <w:jc w:val="left"/>
               <w:rPr>
                 <w:sz w:val="24"/>
                 <w:szCs w:val="24"/>
@@ -4406,25 +4514,26 @@
           </w:tcPr>
           <w:p>
             <w:pPr>
-              <w:jc w:val="both"/>
-              <w:rPr>
-                <w:sz w:val="24"/>
-                <w:szCs w:val="24"/>
-              </w:rPr>
-            </w:pPr>
-            <w:r>
-              <w:rPr>
-                <w:b w:val="0"/>
-                <w:sz w:val="24"/>
-                <w:szCs w:val="24"/>
-              </w:rPr>
-              <w:t>Memicu perubahan atau pencabutan akses lewat pemberitahuan.</w:t>
+              <w:jc w:val="left"/>
+              <w:rPr>
+                <w:sz w:val="24"/>
+                <w:szCs w:val="24"/>
+              </w:rPr>
+            </w:pPr>
+            <w:r>
+              <w:rPr>
+                <w:b w:val="0"/>
+                <w:sz w:val="24"/>
+                <w:szCs w:val="24"/>
+              </w:rPr>
+              <w:t>Memicu perubahan atau pencabutan akses melalui pemberitahuan.</w:t>
             </w:r>
           </w:p>
         </w:tc>
       </w:tr>
       <w:tr>
         <w:trPr>
+          <w:cantSplit/>
           <w:jc w:val="center"/>
         </w:trPr>
         <w:tc>
@@ -4470,7 +4579,7 @@
           </w:tcPr>
           <w:p>
             <w:pPr>
-              <w:jc w:val="both"/>
+              <w:jc w:val="left"/>
               <w:rPr>
                 <w:sz w:val="24"/>
                 <w:szCs w:val="24"/>
@@ -4500,7 +4609,7 @@
           </w:tcPr>
           <w:p>
             <w:pPr>
-              <w:jc w:val="both"/>
+              <w:jc w:val="left"/>
               <w:rPr>
                 <w:sz w:val="24"/>
                 <w:szCs w:val="24"/>
@@ -4519,6 +4628,7 @@
       </w:tr>
       <w:tr>
         <w:trPr>
+          <w:cantSplit/>
           <w:jc w:val="center"/>
         </w:trPr>
         <w:tc>
@@ -4564,7 +4674,7 @@
           </w:tcPr>
           <w:p>
             <w:pPr>
-              <w:jc w:val="both"/>
+              <w:jc w:val="left"/>
               <w:rPr>
                 <w:sz w:val="24"/>
                 <w:szCs w:val="24"/>
@@ -4594,7 +4704,7 @@
           </w:tcPr>
           <w:p>
             <w:pPr>
-              <w:jc w:val="both"/>
+              <w:jc w:val="left"/>
               <w:rPr>
                 <w:sz w:val="24"/>
                 <w:szCs w:val="24"/>
@@ -4613,6 +4723,7 @@
       </w:tr>
       <w:tr>
         <w:trPr>
+          <w:cantSplit/>
           <w:jc w:val="center"/>
         </w:trPr>
         <w:tc>
@@ -4658,7 +4769,7 @@
           </w:tcPr>
           <w:p>
             <w:pPr>
-              <w:jc w:val="both"/>
+              <w:jc w:val="left"/>
               <w:rPr>
                 <w:sz w:val="24"/>
                 <w:szCs w:val="24"/>
@@ -4688,7 +4799,7 @@
           </w:tcPr>
           <w:p>
             <w:pPr>
-              <w:jc w:val="both"/>
+              <w:jc w:val="left"/>
               <w:rPr>
                 <w:sz w:val="24"/>
                 <w:szCs w:val="24"/>
@@ -4707,6 +4818,7 @@
       </w:tr>
       <w:tr>
         <w:trPr>
+          <w:cantSplit/>
           <w:jc w:val="center"/>
         </w:trPr>
         <w:tc>
@@ -4752,7 +4864,7 @@
           </w:tcPr>
           <w:p>
             <w:pPr>
-              <w:jc w:val="both"/>
+              <w:jc w:val="left"/>
               <w:rPr>
                 <w:sz w:val="24"/>
                 <w:szCs w:val="24"/>
@@ -4782,7 +4894,7 @@
           </w:tcPr>
           <w:p>
             <w:pPr>
-              <w:jc w:val="both"/>
+              <w:jc w:val="left"/>
               <w:rPr>
                 <w:sz w:val="24"/>
                 <w:szCs w:val="24"/>
@@ -4801,6 +4913,7 @@
       </w:tr>
       <w:tr>
         <w:trPr>
+          <w:cantSplit/>
           <w:jc w:val="center"/>
         </w:trPr>
         <w:tc>
@@ -4846,7 +4959,7 @@
           </w:tcPr>
           <w:p>
             <w:pPr>
-              <w:jc w:val="both"/>
+              <w:jc w:val="left"/>
               <w:rPr>
                 <w:sz w:val="24"/>
                 <w:szCs w:val="24"/>
@@ -4876,7 +4989,7 @@
           </w:tcPr>
           <w:p>
             <w:pPr>
-              <w:jc w:val="both"/>
+              <w:jc w:val="left"/>
               <w:rPr>
                 <w:sz w:val="24"/>
                 <w:szCs w:val="24"/>
@@ -4928,6 +5041,7 @@
     <w:p>
       <w:pPr>
         <w:pStyle w:val="Heading2"/>
+        <w:keepNext/>
         <w:numPr>
           <w:ilvl w:val="1"/>
           <w:numId w:val="7"/>
@@ -4950,27 +5064,30 @@
         <w:tblLook w:val="0400" w:firstRow="0" w:lastRow="0" w:firstColumn="0" w:lastColumn="0" w:noHBand="0" w:noVBand="1"/>
       </w:tblPr>
       <w:tblGrid>
-        <w:gridCol w:w="3367"/>
-        <w:gridCol w:w="2248"/>
-        <w:gridCol w:w="3913"/>
+        <w:gridCol w:w="4309"/>
+        <w:gridCol w:w="1927"/>
+        <w:gridCol w:w="2835"/>
       </w:tblGrid>
       <w:tr>
         <w:trPr>
+          <w:cantSplit/>
+          <w:tblHeader/>
           <w:jc w:val="center"/>
         </w:trPr>
         <w:tc>
           <w:tcPr>
-            <w:tcW w:w="3367" w:type="dxa"/>
-            <w:tcBorders>
-              <w:top w:val="single" w:sz="8" w:space="0" w:color="000000"/>
-              <w:left w:val="single" w:sz="8" w:space="0" w:color="000000"/>
-              <w:bottom w:val="single" w:sz="8" w:space="0" w:color="000000"/>
-              <w:right w:val="single" w:sz="8" w:space="0" w:color="000000"/>
-            </w:tcBorders>
-            <w:vAlign w:val="center"/>
-          </w:tcPr>
-          <w:p>
-            <w:pPr>
+            <w:tcW w:w="4309" w:type="dxa"/>
+            <w:tcBorders>
+              <w:top w:val="single" w:sz="8" w:space="0" w:color="000000"/>
+              <w:left w:val="single" w:sz="8" w:space="0" w:color="000000"/>
+              <w:bottom w:val="single" w:sz="8" w:space="0" w:color="000000"/>
+              <w:right w:val="single" w:sz="8" w:space="0" w:color="000000"/>
+            </w:tcBorders>
+            <w:vAlign w:val="center"/>
+          </w:tcPr>
+          <w:p>
+            <w:pPr>
+              <w:keepNext/>
               <w:jc w:val="center"/>
               <w:rPr>
                 <w:sz w:val="24"/>
@@ -4990,17 +5107,18 @@
         </w:tc>
         <w:tc>
           <w:tcPr>
-            <w:tcW w:w="2248" w:type="dxa"/>
-            <w:tcBorders>
-              <w:top w:val="single" w:sz="8" w:space="0" w:color="000000"/>
-              <w:left w:val="single" w:sz="8" w:space="0" w:color="000000"/>
-              <w:bottom w:val="single" w:sz="8" w:space="0" w:color="000000"/>
-              <w:right w:val="single" w:sz="8" w:space="0" w:color="000000"/>
-            </w:tcBorders>
-            <w:vAlign w:val="center"/>
-          </w:tcPr>
-          <w:p>
-            <w:pPr>
+            <w:tcW w:w="1927" w:type="dxa"/>
+            <w:tcBorders>
+              <w:top w:val="single" w:sz="8" w:space="0" w:color="000000"/>
+              <w:left w:val="single" w:sz="8" w:space="0" w:color="000000"/>
+              <w:bottom w:val="single" w:sz="8" w:space="0" w:color="000000"/>
+              <w:right w:val="single" w:sz="8" w:space="0" w:color="000000"/>
+            </w:tcBorders>
+            <w:vAlign w:val="center"/>
+          </w:tcPr>
+          <w:p>
+            <w:pPr>
+              <w:keepNext/>
               <w:jc w:val="center"/>
               <w:rPr>
                 <w:sz w:val="24"/>
@@ -5020,17 +5138,18 @@
         </w:tc>
         <w:tc>
           <w:tcPr>
-            <w:tcW w:w="3913" w:type="dxa"/>
-            <w:tcBorders>
-              <w:top w:val="single" w:sz="8" w:space="0" w:color="000000"/>
-              <w:left w:val="single" w:sz="8" w:space="0" w:color="000000"/>
-              <w:bottom w:val="single" w:sz="8" w:space="0" w:color="000000"/>
-              <w:right w:val="single" w:sz="8" w:space="0" w:color="000000"/>
-            </w:tcBorders>
-            <w:vAlign w:val="center"/>
-          </w:tcPr>
-          <w:p>
-            <w:pPr>
+            <w:tcW w:w="2835" w:type="dxa"/>
+            <w:tcBorders>
+              <w:top w:val="single" w:sz="8" w:space="0" w:color="000000"/>
+              <w:left w:val="single" w:sz="8" w:space="0" w:color="000000"/>
+              <w:bottom w:val="single" w:sz="8" w:space="0" w:color="000000"/>
+              <w:right w:val="single" w:sz="8" w:space="0" w:color="000000"/>
+            </w:tcBorders>
+            <w:vAlign w:val="center"/>
+          </w:tcPr>
+          <w:p>
+            <w:pPr>
+              <w:keepNext/>
               <w:jc w:val="center"/>
               <w:rPr>
                 <w:sz w:val="24"/>
@@ -5051,11 +5170,12 @@
       </w:tr>
       <w:tr>
         <w:trPr>
+          <w:cantSplit/>
           <w:jc w:val="center"/>
         </w:trPr>
         <w:tc>
           <w:tcPr>
-            <w:tcW w:w="3367" w:type="dxa"/>
+            <w:tcW w:w="4309" w:type="dxa"/>
             <w:tcBorders>
               <w:top w:val="single" w:sz="8" w:space="0" w:color="000000"/>
               <w:left w:val="single" w:sz="8" w:space="0" w:color="000000"/>
@@ -5083,7 +5203,7 @@
         </w:tc>
         <w:tc>
           <w:tcPr>
-            <w:tcW w:w="2248" w:type="dxa"/>
+            <w:tcW w:w="1927" w:type="dxa"/>
             <w:tcBorders>
               <w:top w:val="single" w:sz="8" w:space="0" w:color="000000"/>
               <w:left w:val="single" w:sz="8" w:space="0" w:color="000000"/>
@@ -5111,41 +5231,42 @@
         </w:tc>
         <w:tc>
           <w:tcPr>
-            <w:tcW w:w="3913" w:type="dxa"/>
-            <w:tcBorders>
-              <w:top w:val="single" w:sz="8" w:space="0" w:color="000000"/>
-              <w:left w:val="single" w:sz="8" w:space="0" w:color="000000"/>
-              <w:bottom w:val="single" w:sz="8" w:space="0" w:color="000000"/>
-              <w:right w:val="single" w:sz="8" w:space="0" w:color="000000"/>
-            </w:tcBorders>
-            <w:vAlign w:val="center"/>
-          </w:tcPr>
-          <w:p>
-            <w:pPr>
-              <w:jc w:val="both"/>
-              <w:rPr>
-                <w:sz w:val="24"/>
-                <w:szCs w:val="24"/>
-              </w:rPr>
-            </w:pPr>
-            <w:r>
-              <w:rPr>
-                <w:b w:val="0"/>
-                <w:sz w:val="24"/>
-                <w:szCs w:val="24"/>
-              </w:rPr>
-              <w:t>Tiket permintaan akses</w:t>
+            <w:tcW w:w="2835" w:type="dxa"/>
+            <w:tcBorders>
+              <w:top w:val="single" w:sz="8" w:space="0" w:color="000000"/>
+              <w:left w:val="single" w:sz="8" w:space="0" w:color="000000"/>
+              <w:bottom w:val="single" w:sz="8" w:space="0" w:color="000000"/>
+              <w:right w:val="single" w:sz="8" w:space="0" w:color="000000"/>
+            </w:tcBorders>
+            <w:vAlign w:val="center"/>
+          </w:tcPr>
+          <w:p>
+            <w:pPr>
+              <w:jc w:val="left"/>
+              <w:rPr>
+                <w:sz w:val="24"/>
+                <w:szCs w:val="24"/>
+              </w:rPr>
+            </w:pPr>
+            <w:r>
+              <w:rPr>
+                <w:b w:val="0"/>
+                <w:sz w:val="24"/>
+                <w:szCs w:val="24"/>
+              </w:rPr>
+              <w:t>Ticket permintaan akses</w:t>
             </w:r>
           </w:p>
         </w:tc>
       </w:tr>
       <w:tr>
         <w:trPr>
+          <w:cantSplit/>
           <w:jc w:val="center"/>
         </w:trPr>
         <w:tc>
           <w:tcPr>
-            <w:tcW w:w="3367" w:type="dxa"/>
+            <w:tcW w:w="4309" w:type="dxa"/>
             <w:tcBorders>
               <w:top w:val="single" w:sz="8" w:space="0" w:color="000000"/>
               <w:left w:val="single" w:sz="8" w:space="0" w:color="000000"/>
@@ -5173,7 +5294,7 @@
         </w:tc>
         <w:tc>
           <w:tcPr>
-            <w:tcW w:w="2248" w:type="dxa"/>
+            <w:tcW w:w="1927" w:type="dxa"/>
             <w:tcBorders>
               <w:top w:val="single" w:sz="8" w:space="0" w:color="000000"/>
               <w:left w:val="single" w:sz="8" w:space="0" w:color="000000"/>
@@ -5201,18 +5322,18 @@
         </w:tc>
         <w:tc>
           <w:tcPr>
-            <w:tcW w:w="3913" w:type="dxa"/>
-            <w:tcBorders>
-              <w:top w:val="single" w:sz="8" w:space="0" w:color="000000"/>
-              <w:left w:val="single" w:sz="8" w:space="0" w:color="000000"/>
-              <w:bottom w:val="single" w:sz="8" w:space="0" w:color="000000"/>
-              <w:right w:val="single" w:sz="8" w:space="0" w:color="000000"/>
-            </w:tcBorders>
-            <w:vAlign w:val="center"/>
-          </w:tcPr>
-          <w:p>
-            <w:pPr>
-              <w:jc w:val="both"/>
+            <w:tcW w:w="2835" w:type="dxa"/>
+            <w:tcBorders>
+              <w:top w:val="single" w:sz="8" w:space="0" w:color="000000"/>
+              <w:left w:val="single" w:sz="8" w:space="0" w:color="000000"/>
+              <w:bottom w:val="single" w:sz="8" w:space="0" w:color="000000"/>
+              <w:right w:val="single" w:sz="8" w:space="0" w:color="000000"/>
+            </w:tcBorders>
+            <w:vAlign w:val="center"/>
+          </w:tcPr>
+          <w:p>
+            <w:pPr>
+              <w:jc w:val="left"/>
               <w:rPr>
                 <w:sz w:val="24"/>
                 <w:szCs w:val="24"/>
@@ -5231,11 +5352,12 @@
       </w:tr>
       <w:tr>
         <w:trPr>
+          <w:cantSplit/>
           <w:jc w:val="center"/>
         </w:trPr>
         <w:tc>
           <w:tcPr>
-            <w:tcW w:w="3367" w:type="dxa"/>
+            <w:tcW w:w="4309" w:type="dxa"/>
             <w:tcBorders>
               <w:top w:val="single" w:sz="8" w:space="0" w:color="000000"/>
               <w:left w:val="single" w:sz="8" w:space="0" w:color="000000"/>
@@ -5263,7 +5385,7 @@
         </w:tc>
         <w:tc>
           <w:tcPr>
-            <w:tcW w:w="2248" w:type="dxa"/>
+            <w:tcW w:w="1927" w:type="dxa"/>
             <w:tcBorders>
               <w:top w:val="single" w:sz="8" w:space="0" w:color="000000"/>
               <w:left w:val="single" w:sz="8" w:space="0" w:color="000000"/>
@@ -5291,41 +5413,42 @@
         </w:tc>
         <w:tc>
           <w:tcPr>
-            <w:tcW w:w="3913" w:type="dxa"/>
-            <w:tcBorders>
-              <w:top w:val="single" w:sz="8" w:space="0" w:color="000000"/>
-              <w:left w:val="single" w:sz="8" w:space="0" w:color="000000"/>
-              <w:bottom w:val="single" w:sz="8" w:space="0" w:color="000000"/>
-              <w:right w:val="single" w:sz="8" w:space="0" w:color="000000"/>
-            </w:tcBorders>
-            <w:vAlign w:val="center"/>
-          </w:tcPr>
-          <w:p>
-            <w:pPr>
-              <w:jc w:val="both"/>
-              <w:rPr>
-                <w:sz w:val="24"/>
-                <w:szCs w:val="24"/>
-              </w:rPr>
-            </w:pPr>
-            <w:r>
-              <w:rPr>
-                <w:b w:val="0"/>
-                <w:sz w:val="24"/>
-                <w:szCs w:val="24"/>
-              </w:rPr>
-              <w:t>Approval pemilik sistem; alasan penolakan dicatat di tiket</w:t>
+            <w:tcW w:w="2835" w:type="dxa"/>
+            <w:tcBorders>
+              <w:top w:val="single" w:sz="8" w:space="0" w:color="000000"/>
+              <w:left w:val="single" w:sz="8" w:space="0" w:color="000000"/>
+              <w:bottom w:val="single" w:sz="8" w:space="0" w:color="000000"/>
+              <w:right w:val="single" w:sz="8" w:space="0" w:color="000000"/>
+            </w:tcBorders>
+            <w:vAlign w:val="center"/>
+          </w:tcPr>
+          <w:p>
+            <w:pPr>
+              <w:jc w:val="left"/>
+              <w:rPr>
+                <w:sz w:val="24"/>
+                <w:szCs w:val="24"/>
+              </w:rPr>
+            </w:pPr>
+            <w:r>
+              <w:rPr>
+                <w:b w:val="0"/>
+                <w:sz w:val="24"/>
+                <w:szCs w:val="24"/>
+              </w:rPr>
+              <w:t>Approval pemilik sistem; alasan penolakan dicatat di ticket</w:t>
             </w:r>
           </w:p>
         </w:tc>
       </w:tr>
       <w:tr>
         <w:trPr>
+          <w:cantSplit/>
           <w:jc w:val="center"/>
         </w:trPr>
         <w:tc>
           <w:tcPr>
-            <w:tcW w:w="3367" w:type="dxa"/>
+            <w:tcW w:w="4309" w:type="dxa"/>
             <w:tcBorders>
               <w:top w:val="single" w:sz="8" w:space="0" w:color="000000"/>
               <w:left w:val="single" w:sz="8" w:space="0" w:color="000000"/>
@@ -5353,7 +5476,7 @@
         </w:tc>
         <w:tc>
           <w:tcPr>
-            <w:tcW w:w="2248" w:type="dxa"/>
+            <w:tcW w:w="1927" w:type="dxa"/>
             <w:tcBorders>
               <w:top w:val="single" w:sz="8" w:space="0" w:color="000000"/>
               <w:left w:val="single" w:sz="8" w:space="0" w:color="000000"/>
@@ -5381,18 +5504,18 @@
         </w:tc>
         <w:tc>
           <w:tcPr>
-            <w:tcW w:w="3913" w:type="dxa"/>
-            <w:tcBorders>
-              <w:top w:val="single" w:sz="8" w:space="0" w:color="000000"/>
-              <w:left w:val="single" w:sz="8" w:space="0" w:color="000000"/>
-              <w:bottom w:val="single" w:sz="8" w:space="0" w:color="000000"/>
-              <w:right w:val="single" w:sz="8" w:space="0" w:color="000000"/>
-            </w:tcBorders>
-            <w:vAlign w:val="center"/>
-          </w:tcPr>
-          <w:p>
-            <w:pPr>
-              <w:jc w:val="both"/>
+            <w:tcW w:w="2835" w:type="dxa"/>
+            <w:tcBorders>
+              <w:top w:val="single" w:sz="8" w:space="0" w:color="000000"/>
+              <w:left w:val="single" w:sz="8" w:space="0" w:color="000000"/>
+              <w:bottom w:val="single" w:sz="8" w:space="0" w:color="000000"/>
+              <w:right w:val="single" w:sz="8" w:space="0" w:color="000000"/>
+            </w:tcBorders>
+            <w:vAlign w:val="center"/>
+          </w:tcPr>
+          <w:p>
+            <w:pPr>
+              <w:jc w:val="left"/>
               <w:rPr>
                 <w:sz w:val="24"/>
                 <w:szCs w:val="24"/>
@@ -5411,39 +5534,40 @@
       </w:tr>
       <w:tr>
         <w:trPr>
+          <w:cantSplit/>
           <w:jc w:val="center"/>
         </w:trPr>
         <w:tc>
           <w:tcPr>
-            <w:tcW w:w="3367" w:type="dxa"/>
-            <w:tcBorders>
-              <w:top w:val="single" w:sz="8" w:space="0" w:color="000000"/>
-              <w:left w:val="single" w:sz="8" w:space="0" w:color="000000"/>
-              <w:bottom w:val="single" w:sz="8" w:space="0" w:color="000000"/>
-              <w:right w:val="single" w:sz="8" w:space="0" w:color="000000"/>
-            </w:tcBorders>
-            <w:vAlign w:val="center"/>
-          </w:tcPr>
-          <w:p>
-            <w:pPr>
-              <w:rPr>
-                <w:sz w:val="24"/>
-                <w:szCs w:val="24"/>
-              </w:rPr>
-            </w:pPr>
-            <w:r>
-              <w:rPr>
-                <w:b w:val="0"/>
-                <w:sz w:val="24"/>
-                <w:szCs w:val="24"/>
-              </w:rPr>
-              <w:t>5. Setujui akses privileged ke sistem pelanggan; bila kontrak mensyaratkan, akses baru diberikan sesudah pelanggan menyetujui.</w:t>
-            </w:r>
-          </w:p>
-        </w:tc>
-        <w:tc>
-          <w:tcPr>
-            <w:tcW w:w="2248" w:type="dxa"/>
+            <w:tcW w:w="4309" w:type="dxa"/>
+            <w:tcBorders>
+              <w:top w:val="single" w:sz="8" w:space="0" w:color="000000"/>
+              <w:left w:val="single" w:sz="8" w:space="0" w:color="000000"/>
+              <w:bottom w:val="single" w:sz="8" w:space="0" w:color="000000"/>
+              <w:right w:val="single" w:sz="8" w:space="0" w:color="000000"/>
+            </w:tcBorders>
+            <w:vAlign w:val="center"/>
+          </w:tcPr>
+          <w:p>
+            <w:pPr>
+              <w:rPr>
+                <w:sz w:val="24"/>
+                <w:szCs w:val="24"/>
+              </w:rPr>
+            </w:pPr>
+            <w:r>
+              <w:rPr>
+                <w:b w:val="0"/>
+                <w:sz w:val="24"/>
+                <w:szCs w:val="24"/>
+              </w:rPr>
+              <w:t>5. Setujui akses privileged ke sistem pelanggan; jika kontrak mensyaratkan, akses baru diberikan setelah pelanggan menyetujui.</w:t>
+            </w:r>
+          </w:p>
+        </w:tc>
+        <w:tc>
+          <w:tcPr>
+            <w:tcW w:w="1927" w:type="dxa"/>
             <w:tcBorders>
               <w:top w:val="single" w:sz="8" w:space="0" w:color="000000"/>
               <w:left w:val="single" w:sz="8" w:space="0" w:color="000000"/>
@@ -5471,41 +5595,42 @@
         </w:tc>
         <w:tc>
           <w:tcPr>
-            <w:tcW w:w="3913" w:type="dxa"/>
-            <w:tcBorders>
-              <w:top w:val="single" w:sz="8" w:space="0" w:color="000000"/>
-              <w:left w:val="single" w:sz="8" w:space="0" w:color="000000"/>
-              <w:bottom w:val="single" w:sz="8" w:space="0" w:color="000000"/>
-              <w:right w:val="single" w:sz="8" w:space="0" w:color="000000"/>
-            </w:tcBorders>
-            <w:vAlign w:val="center"/>
-          </w:tcPr>
-          <w:p>
-            <w:pPr>
-              <w:jc w:val="both"/>
-              <w:rPr>
-                <w:sz w:val="24"/>
-                <w:szCs w:val="24"/>
-              </w:rPr>
-            </w:pPr>
-            <w:r>
-              <w:rPr>
-                <w:b w:val="0"/>
-                <w:sz w:val="24"/>
-                <w:szCs w:val="24"/>
-              </w:rPr>
-              <w:t>Approval Head of Operation; persetujuan pelanggan bila disyaratkan</w:t>
+            <w:tcW w:w="2835" w:type="dxa"/>
+            <w:tcBorders>
+              <w:top w:val="single" w:sz="8" w:space="0" w:color="000000"/>
+              <w:left w:val="single" w:sz="8" w:space="0" w:color="000000"/>
+              <w:bottom w:val="single" w:sz="8" w:space="0" w:color="000000"/>
+              <w:right w:val="single" w:sz="8" w:space="0" w:color="000000"/>
+            </w:tcBorders>
+            <w:vAlign w:val="center"/>
+          </w:tcPr>
+          <w:p>
+            <w:pPr>
+              <w:jc w:val="left"/>
+              <w:rPr>
+                <w:sz w:val="24"/>
+                <w:szCs w:val="24"/>
+              </w:rPr>
+            </w:pPr>
+            <w:r>
+              <w:rPr>
+                <w:b w:val="0"/>
+                <w:sz w:val="24"/>
+                <w:szCs w:val="24"/>
+              </w:rPr>
+              <w:t>Approval Head of Operation; persetujuan pelanggan jika disyaratkan</w:t>
             </w:r>
           </w:p>
         </w:tc>
       </w:tr>
       <w:tr>
         <w:trPr>
+          <w:cantSplit/>
           <w:jc w:val="center"/>
         </w:trPr>
         <w:tc>
           <w:tcPr>
-            <w:tcW w:w="3367" w:type="dxa"/>
+            <w:tcW w:w="4309" w:type="dxa"/>
             <w:tcBorders>
               <w:top w:val="single" w:sz="8" w:space="0" w:color="000000"/>
               <w:left w:val="single" w:sz="8" w:space="0" w:color="000000"/>
@@ -5533,7 +5658,7 @@
         </w:tc>
         <w:tc>
           <w:tcPr>
-            <w:tcW w:w="2248" w:type="dxa"/>
+            <w:tcW w:w="1927" w:type="dxa"/>
             <w:tcBorders>
               <w:top w:val="single" w:sz="8" w:space="0" w:color="000000"/>
               <w:left w:val="single" w:sz="8" w:space="0" w:color="000000"/>
@@ -5561,18 +5686,18 @@
         </w:tc>
         <w:tc>
           <w:tcPr>
-            <w:tcW w:w="3913" w:type="dxa"/>
-            <w:tcBorders>
-              <w:top w:val="single" w:sz="8" w:space="0" w:color="000000"/>
-              <w:left w:val="single" w:sz="8" w:space="0" w:color="000000"/>
-              <w:bottom w:val="single" w:sz="8" w:space="0" w:color="000000"/>
-              <w:right w:val="single" w:sz="8" w:space="0" w:color="000000"/>
-            </w:tcBorders>
-            <w:vAlign w:val="center"/>
-          </w:tcPr>
-          <w:p>
-            <w:pPr>
-              <w:jc w:val="both"/>
+            <w:tcW w:w="2835" w:type="dxa"/>
+            <w:tcBorders>
+              <w:top w:val="single" w:sz="8" w:space="0" w:color="000000"/>
+              <w:left w:val="single" w:sz="8" w:space="0" w:color="000000"/>
+              <w:bottom w:val="single" w:sz="8" w:space="0" w:color="000000"/>
+              <w:right w:val="single" w:sz="8" w:space="0" w:color="000000"/>
+            </w:tcBorders>
+            <w:vAlign w:val="center"/>
+          </w:tcPr>
+          <w:p>
+            <w:pPr>
+              <w:jc w:val="left"/>
               <w:rPr>
                 <w:sz w:val="24"/>
                 <w:szCs w:val="24"/>
@@ -5591,39 +5716,40 @@
       </w:tr>
       <w:tr>
         <w:trPr>
+          <w:cantSplit/>
           <w:jc w:val="center"/>
         </w:trPr>
         <w:tc>
           <w:tcPr>
-            <w:tcW w:w="3367" w:type="dxa"/>
-            <w:tcBorders>
-              <w:top w:val="single" w:sz="8" w:space="0" w:color="000000"/>
-              <w:left w:val="single" w:sz="8" w:space="0" w:color="000000"/>
-              <w:bottom w:val="single" w:sz="8" w:space="0" w:color="000000"/>
-              <w:right w:val="single" w:sz="8" w:space="0" w:color="000000"/>
-            </w:tcBorders>
-            <w:vAlign w:val="center"/>
-          </w:tcPr>
-          <w:p>
-            <w:pPr>
-              <w:rPr>
-                <w:sz w:val="24"/>
-                <w:szCs w:val="24"/>
-              </w:rPr>
-            </w:pPr>
-            <w:r>
-              <w:rPr>
-                <w:b w:val="0"/>
-                <w:sz w:val="24"/>
-                <w:szCs w:val="24"/>
-              </w:rPr>
-              <w:t>7. Aktifkan MFA pada akun bila sistem mendukung.</w:t>
-            </w:r>
-          </w:p>
-        </w:tc>
-        <w:tc>
-          <w:tcPr>
-            <w:tcW w:w="2248" w:type="dxa"/>
+            <w:tcW w:w="4309" w:type="dxa"/>
+            <w:tcBorders>
+              <w:top w:val="single" w:sz="8" w:space="0" w:color="000000"/>
+              <w:left w:val="single" w:sz="8" w:space="0" w:color="000000"/>
+              <w:bottom w:val="single" w:sz="8" w:space="0" w:color="000000"/>
+              <w:right w:val="single" w:sz="8" w:space="0" w:color="000000"/>
+            </w:tcBorders>
+            <w:vAlign w:val="center"/>
+          </w:tcPr>
+          <w:p>
+            <w:pPr>
+              <w:rPr>
+                <w:sz w:val="24"/>
+                <w:szCs w:val="24"/>
+              </w:rPr>
+            </w:pPr>
+            <w:r>
+              <w:rPr>
+                <w:b w:val="0"/>
+                <w:sz w:val="24"/>
+                <w:szCs w:val="24"/>
+              </w:rPr>
+              <w:t>7. Aktifkan MFA pada akun jika sistem mendukung.</w:t>
+            </w:r>
+          </w:p>
+        </w:tc>
+        <w:tc>
+          <w:tcPr>
+            <w:tcW w:w="1927" w:type="dxa"/>
             <w:tcBorders>
               <w:top w:val="single" w:sz="8" w:space="0" w:color="000000"/>
               <w:left w:val="single" w:sz="8" w:space="0" w:color="000000"/>
@@ -5651,18 +5777,18 @@
         </w:tc>
         <w:tc>
           <w:tcPr>
-            <w:tcW w:w="3913" w:type="dxa"/>
-            <w:tcBorders>
-              <w:top w:val="single" w:sz="8" w:space="0" w:color="000000"/>
-              <w:left w:val="single" w:sz="8" w:space="0" w:color="000000"/>
-              <w:bottom w:val="single" w:sz="8" w:space="0" w:color="000000"/>
-              <w:right w:val="single" w:sz="8" w:space="0" w:color="000000"/>
-            </w:tcBorders>
-            <w:vAlign w:val="center"/>
-          </w:tcPr>
-          <w:p>
-            <w:pPr>
-              <w:jc w:val="both"/>
+            <w:tcW w:w="2835" w:type="dxa"/>
+            <w:tcBorders>
+              <w:top w:val="single" w:sz="8" w:space="0" w:color="000000"/>
+              <w:left w:val="single" w:sz="8" w:space="0" w:color="000000"/>
+              <w:bottom w:val="single" w:sz="8" w:space="0" w:color="000000"/>
+              <w:right w:val="single" w:sz="8" w:space="0" w:color="000000"/>
+            </w:tcBorders>
+            <w:vAlign w:val="center"/>
+          </w:tcPr>
+          <w:p>
+            <w:pPr>
+              <w:jc w:val="left"/>
               <w:rPr>
                 <w:sz w:val="24"/>
                 <w:szCs w:val="24"/>
@@ -5681,11 +5807,12 @@
       </w:tr>
       <w:tr>
         <w:trPr>
+          <w:cantSplit/>
           <w:jc w:val="center"/>
         </w:trPr>
         <w:tc>
           <w:tcPr>
-            <w:tcW w:w="3367" w:type="dxa"/>
+            <w:tcW w:w="4309" w:type="dxa"/>
             <w:tcBorders>
               <w:top w:val="single" w:sz="8" w:space="0" w:color="000000"/>
               <w:left w:val="single" w:sz="8" w:space="0" w:color="000000"/>
@@ -5713,7 +5840,7 @@
         </w:tc>
         <w:tc>
           <w:tcPr>
-            <w:tcW w:w="2248" w:type="dxa"/>
+            <w:tcW w:w="1927" w:type="dxa"/>
             <w:tcBorders>
               <w:top w:val="single" w:sz="8" w:space="0" w:color="000000"/>
               <w:left w:val="single" w:sz="8" w:space="0" w:color="000000"/>
@@ -5741,18 +5868,18 @@
         </w:tc>
         <w:tc>
           <w:tcPr>
-            <w:tcW w:w="3913" w:type="dxa"/>
-            <w:tcBorders>
-              <w:top w:val="single" w:sz="8" w:space="0" w:color="000000"/>
-              <w:left w:val="single" w:sz="8" w:space="0" w:color="000000"/>
-              <w:bottom w:val="single" w:sz="8" w:space="0" w:color="000000"/>
-              <w:right w:val="single" w:sz="8" w:space="0" w:color="000000"/>
-            </w:tcBorders>
-            <w:vAlign w:val="center"/>
-          </w:tcPr>
-          <w:p>
-            <w:pPr>
-              <w:jc w:val="both"/>
+            <w:tcW w:w="2835" w:type="dxa"/>
+            <w:tcBorders>
+              <w:top w:val="single" w:sz="8" w:space="0" w:color="000000"/>
+              <w:left w:val="single" w:sz="8" w:space="0" w:color="000000"/>
+              <w:bottom w:val="single" w:sz="8" w:space="0" w:color="000000"/>
+              <w:right w:val="single" w:sz="8" w:space="0" w:color="000000"/>
+            </w:tcBorders>
+            <w:vAlign w:val="center"/>
+          </w:tcPr>
+          <w:p>
+            <w:pPr>
+              <w:jc w:val="left"/>
               <w:rPr>
                 <w:sz w:val="24"/>
                 <w:szCs w:val="24"/>
@@ -5771,39 +5898,40 @@
       </w:tr>
       <w:tr>
         <w:trPr>
+          <w:cantSplit/>
           <w:jc w:val="center"/>
         </w:trPr>
         <w:tc>
           <w:tcPr>
-            <w:tcW w:w="3367" w:type="dxa"/>
-            <w:tcBorders>
-              <w:top w:val="single" w:sz="8" w:space="0" w:color="000000"/>
-              <w:left w:val="single" w:sz="8" w:space="0" w:color="000000"/>
-              <w:bottom w:val="single" w:sz="8" w:space="0" w:color="000000"/>
-              <w:right w:val="single" w:sz="8" w:space="0" w:color="000000"/>
-            </w:tcBorders>
-            <w:vAlign w:val="center"/>
-          </w:tcPr>
-          <w:p>
-            <w:pPr>
-              <w:rPr>
-                <w:sz w:val="24"/>
-                <w:szCs w:val="24"/>
-              </w:rPr>
-            </w:pPr>
-            <w:r>
-              <w:rPr>
-                <w:b w:val="0"/>
-                <w:sz w:val="24"/>
-                <w:szCs w:val="24"/>
-              </w:rPr>
-              <w:t>9. Serahkan kredensial awal lewat password manager.</w:t>
-            </w:r>
-          </w:p>
-        </w:tc>
-        <w:tc>
-          <w:tcPr>
-            <w:tcW w:w="2248" w:type="dxa"/>
+            <w:tcW w:w="4309" w:type="dxa"/>
+            <w:tcBorders>
+              <w:top w:val="single" w:sz="8" w:space="0" w:color="000000"/>
+              <w:left w:val="single" w:sz="8" w:space="0" w:color="000000"/>
+              <w:bottom w:val="single" w:sz="8" w:space="0" w:color="000000"/>
+              <w:right w:val="single" w:sz="8" w:space="0" w:color="000000"/>
+            </w:tcBorders>
+            <w:vAlign w:val="center"/>
+          </w:tcPr>
+          <w:p>
+            <w:pPr>
+              <w:rPr>
+                <w:sz w:val="24"/>
+                <w:szCs w:val="24"/>
+              </w:rPr>
+            </w:pPr>
+            <w:r>
+              <w:rPr>
+                <w:b w:val="0"/>
+                <w:sz w:val="24"/>
+                <w:szCs w:val="24"/>
+              </w:rPr>
+              <w:t>9. Serahkan kredensial awal melalui password manager.</w:t>
+            </w:r>
+          </w:p>
+        </w:tc>
+        <w:tc>
+          <w:tcPr>
+            <w:tcW w:w="1927" w:type="dxa"/>
             <w:tcBorders>
               <w:top w:val="single" w:sz="8" w:space="0" w:color="000000"/>
               <w:left w:val="single" w:sz="8" w:space="0" w:color="000000"/>
@@ -5831,18 +5959,18 @@
         </w:tc>
         <w:tc>
           <w:tcPr>
-            <w:tcW w:w="3913" w:type="dxa"/>
-            <w:tcBorders>
-              <w:top w:val="single" w:sz="8" w:space="0" w:color="000000"/>
-              <w:left w:val="single" w:sz="8" w:space="0" w:color="000000"/>
-              <w:bottom w:val="single" w:sz="8" w:space="0" w:color="000000"/>
-              <w:right w:val="single" w:sz="8" w:space="0" w:color="000000"/>
-            </w:tcBorders>
-            <w:vAlign w:val="center"/>
-          </w:tcPr>
-          <w:p>
-            <w:pPr>
-              <w:jc w:val="both"/>
+            <w:tcW w:w="2835" w:type="dxa"/>
+            <w:tcBorders>
+              <w:top w:val="single" w:sz="8" w:space="0" w:color="000000"/>
+              <w:left w:val="single" w:sz="8" w:space="0" w:color="000000"/>
+              <w:bottom w:val="single" w:sz="8" w:space="0" w:color="000000"/>
+              <w:right w:val="single" w:sz="8" w:space="0" w:color="000000"/>
+            </w:tcBorders>
+            <w:vAlign w:val="center"/>
+          </w:tcPr>
+          <w:p>
+            <w:pPr>
+              <w:jc w:val="left"/>
               <w:rPr>
                 <w:sz w:val="24"/>
                 <w:szCs w:val="24"/>
@@ -5861,11 +5989,12 @@
       </w:tr>
       <w:tr>
         <w:trPr>
+          <w:cantSplit/>
           <w:jc w:val="center"/>
         </w:trPr>
         <w:tc>
           <w:tcPr>
-            <w:tcW w:w="3367" w:type="dxa"/>
+            <w:tcW w:w="4309" w:type="dxa"/>
             <w:tcBorders>
               <w:top w:val="single" w:sz="8" w:space="0" w:color="000000"/>
               <w:left w:val="single" w:sz="8" w:space="0" w:color="000000"/>
@@ -5893,7 +6022,7 @@
         </w:tc>
         <w:tc>
           <w:tcPr>
-            <w:tcW w:w="2248" w:type="dxa"/>
+            <w:tcW w:w="1927" w:type="dxa"/>
             <w:tcBorders>
               <w:top w:val="single" w:sz="8" w:space="0" w:color="000000"/>
               <w:left w:val="single" w:sz="8" w:space="0" w:color="000000"/>
@@ -5921,18 +6050,18 @@
         </w:tc>
         <w:tc>
           <w:tcPr>
-            <w:tcW w:w="3913" w:type="dxa"/>
-            <w:tcBorders>
-              <w:top w:val="single" w:sz="8" w:space="0" w:color="000000"/>
-              <w:left w:val="single" w:sz="8" w:space="0" w:color="000000"/>
-              <w:bottom w:val="single" w:sz="8" w:space="0" w:color="000000"/>
-              <w:right w:val="single" w:sz="8" w:space="0" w:color="000000"/>
-            </w:tcBorders>
-            <w:vAlign w:val="center"/>
-          </w:tcPr>
-          <w:p>
-            <w:pPr>
-              <w:jc w:val="both"/>
+            <w:tcW w:w="2835" w:type="dxa"/>
+            <w:tcBorders>
+              <w:top w:val="single" w:sz="8" w:space="0" w:color="000000"/>
+              <w:left w:val="single" w:sz="8" w:space="0" w:color="000000"/>
+              <w:bottom w:val="single" w:sz="8" w:space="0" w:color="000000"/>
+              <w:right w:val="single" w:sz="8" w:space="0" w:color="000000"/>
+            </w:tcBorders>
+            <w:vAlign w:val="center"/>
+          </w:tcPr>
+          <w:p>
+            <w:pPr>
+              <w:jc w:val="left"/>
               <w:rPr>
                 <w:sz w:val="24"/>
                 <w:szCs w:val="24"/>
@@ -5989,6 +6118,7 @@
     </w:p>
     <w:p>
       <w:pPr>
+        <w:keepNext/>
         <w:pBdr>
           <w:top w:val="nil"/>
           <w:left w:val="nil"/>
@@ -6008,7 +6138,7 @@
           <w:sz w:val="24"/>
           <w:szCs w:val="24"/>
         </w:rPr>
-        <w:t xml:space="preserve">Kredensial tidak dikirim lewat chat, tiket, email, atau dokumen.</w:t>
+        <w:t xml:space="preserve">Kredensial tidak dikirim melalui chat, ticket, email, atau dokumen.</w:t>
       </w:r>
     </w:p>
     <w:tbl>
@@ -6021,27 +6151,30 @@
         <w:tblLook w:val="0400" w:firstRow="0" w:lastRow="0" w:firstColumn="0" w:lastColumn="0" w:noHBand="0" w:noVBand="1"/>
       </w:tblPr>
       <w:tblGrid>
-        <w:gridCol w:w="3367"/>
-        <w:gridCol w:w="2248"/>
-        <w:gridCol w:w="3913"/>
+        <w:gridCol w:w="4309"/>
+        <w:gridCol w:w="1927"/>
+        <w:gridCol w:w="2835"/>
       </w:tblGrid>
       <w:tr>
         <w:trPr>
+          <w:cantSplit/>
+          <w:tblHeader/>
           <w:jc w:val="center"/>
         </w:trPr>
         <w:tc>
           <w:tcPr>
-            <w:tcW w:w="3367" w:type="dxa"/>
-            <w:tcBorders>
-              <w:top w:val="single" w:sz="8" w:space="0" w:color="000000"/>
-              <w:left w:val="single" w:sz="8" w:space="0" w:color="000000"/>
-              <w:bottom w:val="single" w:sz="8" w:space="0" w:color="000000"/>
-              <w:right w:val="single" w:sz="8" w:space="0" w:color="000000"/>
-            </w:tcBorders>
-            <w:vAlign w:val="center"/>
-          </w:tcPr>
-          <w:p>
-            <w:pPr>
+            <w:tcW w:w="4309" w:type="dxa"/>
+            <w:tcBorders>
+              <w:top w:val="single" w:sz="8" w:space="0" w:color="000000"/>
+              <w:left w:val="single" w:sz="8" w:space="0" w:color="000000"/>
+              <w:bottom w:val="single" w:sz="8" w:space="0" w:color="000000"/>
+              <w:right w:val="single" w:sz="8" w:space="0" w:color="000000"/>
+            </w:tcBorders>
+            <w:vAlign w:val="center"/>
+          </w:tcPr>
+          <w:p>
+            <w:pPr>
+              <w:keepNext/>
               <w:jc w:val="center"/>
               <w:rPr>
                 <w:sz w:val="24"/>
@@ -6061,17 +6194,18 @@
         </w:tc>
         <w:tc>
           <w:tcPr>
-            <w:tcW w:w="2248" w:type="dxa"/>
-            <w:tcBorders>
-              <w:top w:val="single" w:sz="8" w:space="0" w:color="000000"/>
-              <w:left w:val="single" w:sz="8" w:space="0" w:color="000000"/>
-              <w:bottom w:val="single" w:sz="8" w:space="0" w:color="000000"/>
-              <w:right w:val="single" w:sz="8" w:space="0" w:color="000000"/>
-            </w:tcBorders>
-            <w:vAlign w:val="center"/>
-          </w:tcPr>
-          <w:p>
-            <w:pPr>
+            <w:tcW w:w="1927" w:type="dxa"/>
+            <w:tcBorders>
+              <w:top w:val="single" w:sz="8" w:space="0" w:color="000000"/>
+              <w:left w:val="single" w:sz="8" w:space="0" w:color="000000"/>
+              <w:bottom w:val="single" w:sz="8" w:space="0" w:color="000000"/>
+              <w:right w:val="single" w:sz="8" w:space="0" w:color="000000"/>
+            </w:tcBorders>
+            <w:vAlign w:val="center"/>
+          </w:tcPr>
+          <w:p>
+            <w:pPr>
+              <w:keepNext/>
               <w:jc w:val="center"/>
               <w:rPr>
                 <w:sz w:val="24"/>
@@ -6091,17 +6225,18 @@
         </w:tc>
         <w:tc>
           <w:tcPr>
-            <w:tcW w:w="3913" w:type="dxa"/>
-            <w:tcBorders>
-              <w:top w:val="single" w:sz="8" w:space="0" w:color="000000"/>
-              <w:left w:val="single" w:sz="8" w:space="0" w:color="000000"/>
-              <w:bottom w:val="single" w:sz="8" w:space="0" w:color="000000"/>
-              <w:right w:val="single" w:sz="8" w:space="0" w:color="000000"/>
-            </w:tcBorders>
-            <w:vAlign w:val="center"/>
-          </w:tcPr>
-          <w:p>
-            <w:pPr>
+            <w:tcW w:w="2835" w:type="dxa"/>
+            <w:tcBorders>
+              <w:top w:val="single" w:sz="8" w:space="0" w:color="000000"/>
+              <w:left w:val="single" w:sz="8" w:space="0" w:color="000000"/>
+              <w:bottom w:val="single" w:sz="8" w:space="0" w:color="000000"/>
+              <w:right w:val="single" w:sz="8" w:space="0" w:color="000000"/>
+            </w:tcBorders>
+            <w:vAlign w:val="center"/>
+          </w:tcPr>
+          <w:p>
+            <w:pPr>
+              <w:keepNext/>
               <w:jc w:val="center"/>
               <w:rPr>
                 <w:sz w:val="24"/>
@@ -6122,39 +6257,40 @@
       </w:tr>
       <w:tr>
         <w:trPr>
+          <w:cantSplit/>
           <w:jc w:val="center"/>
         </w:trPr>
         <w:tc>
           <w:tcPr>
-            <w:tcW w:w="3367" w:type="dxa"/>
-            <w:tcBorders>
-              <w:top w:val="single" w:sz="8" w:space="0" w:color="000000"/>
-              <w:left w:val="single" w:sz="8" w:space="0" w:color="000000"/>
-              <w:bottom w:val="single" w:sz="8" w:space="0" w:color="000000"/>
-              <w:right w:val="single" w:sz="8" w:space="0" w:color="000000"/>
-            </w:tcBorders>
-            <w:vAlign w:val="center"/>
-          </w:tcPr>
-          <w:p>
-            <w:pPr>
-              <w:rPr>
-                <w:sz w:val="24"/>
-                <w:szCs w:val="24"/>
-              </w:rPr>
-            </w:pPr>
-            <w:r>
-              <w:rPr>
-                <w:b w:val="0"/>
-                <w:sz w:val="24"/>
-                <w:szCs w:val="24"/>
-              </w:rPr>
-              <w:t>1. Aktifkan MFA pada email, password manager, Jumphost, console cloud, Cloudflare, dan semua akses dari internet ke sistem administratif, bila sistem mendukung.</w:t>
-            </w:r>
-          </w:p>
-        </w:tc>
-        <w:tc>
-          <w:tcPr>
-            <w:tcW w:w="2248" w:type="dxa"/>
+            <w:tcW w:w="4309" w:type="dxa"/>
+            <w:tcBorders>
+              <w:top w:val="single" w:sz="8" w:space="0" w:color="000000"/>
+              <w:left w:val="single" w:sz="8" w:space="0" w:color="000000"/>
+              <w:bottom w:val="single" w:sz="8" w:space="0" w:color="000000"/>
+              <w:right w:val="single" w:sz="8" w:space="0" w:color="000000"/>
+            </w:tcBorders>
+            <w:vAlign w:val="center"/>
+          </w:tcPr>
+          <w:p>
+            <w:pPr>
+              <w:rPr>
+                <w:sz w:val="24"/>
+                <w:szCs w:val="24"/>
+              </w:rPr>
+            </w:pPr>
+            <w:r>
+              <w:rPr>
+                <w:b w:val="0"/>
+                <w:sz w:val="24"/>
+                <w:szCs w:val="24"/>
+              </w:rPr>
+              <w:t>1. Aktifkan MFA pada email, password manager, Jumphost, console cloud, Cloudflare, dan semua akses dari internet ke sistem administratif, jika sistem mendukung.</w:t>
+            </w:r>
+          </w:p>
+        </w:tc>
+        <w:tc>
+          <w:tcPr>
+            <w:tcW w:w="1927" w:type="dxa"/>
             <w:tcBorders>
               <w:top w:val="single" w:sz="8" w:space="0" w:color="000000"/>
               <w:left w:val="single" w:sz="8" w:space="0" w:color="000000"/>
@@ -6182,18 +6318,18 @@
         </w:tc>
         <w:tc>
           <w:tcPr>
-            <w:tcW w:w="3913" w:type="dxa"/>
-            <w:tcBorders>
-              <w:top w:val="single" w:sz="8" w:space="0" w:color="000000"/>
-              <w:left w:val="single" w:sz="8" w:space="0" w:color="000000"/>
-              <w:bottom w:val="single" w:sz="8" w:space="0" w:color="000000"/>
-              <w:right w:val="single" w:sz="8" w:space="0" w:color="000000"/>
-            </w:tcBorders>
-            <w:vAlign w:val="center"/>
-          </w:tcPr>
-          <w:p>
-            <w:pPr>
-              <w:jc w:val="both"/>
+            <w:tcW w:w="2835" w:type="dxa"/>
+            <w:tcBorders>
+              <w:top w:val="single" w:sz="8" w:space="0" w:color="000000"/>
+              <w:left w:val="single" w:sz="8" w:space="0" w:color="000000"/>
+              <w:bottom w:val="single" w:sz="8" w:space="0" w:color="000000"/>
+              <w:right w:val="single" w:sz="8" w:space="0" w:color="000000"/>
+            </w:tcBorders>
+            <w:vAlign w:val="center"/>
+          </w:tcPr>
+          <w:p>
+            <w:pPr>
+              <w:jc w:val="left"/>
               <w:rPr>
                 <w:sz w:val="24"/>
                 <w:szCs w:val="24"/>
@@ -6212,11 +6348,12 @@
       </w:tr>
       <w:tr>
         <w:trPr>
+          <w:cantSplit/>
           <w:jc w:val="center"/>
         </w:trPr>
         <w:tc>
           <w:tcPr>
-            <w:tcW w:w="3367" w:type="dxa"/>
+            <w:tcW w:w="4309" w:type="dxa"/>
             <w:tcBorders>
               <w:top w:val="single" w:sz="8" w:space="0" w:color="000000"/>
               <w:left w:val="single" w:sz="8" w:space="0" w:color="000000"/>
@@ -6244,7 +6381,7 @@
         </w:tc>
         <w:tc>
           <w:tcPr>
-            <w:tcW w:w="2248" w:type="dxa"/>
+            <w:tcW w:w="1927" w:type="dxa"/>
             <w:tcBorders>
               <w:top w:val="single" w:sz="8" w:space="0" w:color="000000"/>
               <w:left w:val="single" w:sz="8" w:space="0" w:color="000000"/>
@@ -6272,18 +6409,18 @@
         </w:tc>
         <w:tc>
           <w:tcPr>
-            <w:tcW w:w="3913" w:type="dxa"/>
-            <w:tcBorders>
-              <w:top w:val="single" w:sz="8" w:space="0" w:color="000000"/>
-              <w:left w:val="single" w:sz="8" w:space="0" w:color="000000"/>
-              <w:bottom w:val="single" w:sz="8" w:space="0" w:color="000000"/>
-              <w:right w:val="single" w:sz="8" w:space="0" w:color="000000"/>
-            </w:tcBorders>
-            <w:vAlign w:val="center"/>
-          </w:tcPr>
-          <w:p>
-            <w:pPr>
-              <w:jc w:val="both"/>
+            <w:tcW w:w="2835" w:type="dxa"/>
+            <w:tcBorders>
+              <w:top w:val="single" w:sz="8" w:space="0" w:color="000000"/>
+              <w:left w:val="single" w:sz="8" w:space="0" w:color="000000"/>
+              <w:bottom w:val="single" w:sz="8" w:space="0" w:color="000000"/>
+              <w:right w:val="single" w:sz="8" w:space="0" w:color="000000"/>
+            </w:tcBorders>
+            <w:vAlign w:val="center"/>
+          </w:tcPr>
+          <w:p>
+            <w:pPr>
+              <w:jc w:val="left"/>
               <w:rPr>
                 <w:sz w:val="24"/>
                 <w:szCs w:val="24"/>
@@ -6302,11 +6439,12 @@
       </w:tr>
       <w:tr>
         <w:trPr>
+          <w:cantSplit/>
           <w:jc w:val="center"/>
         </w:trPr>
         <w:tc>
           <w:tcPr>
-            <w:tcW w:w="3367" w:type="dxa"/>
+            <w:tcW w:w="4309" w:type="dxa"/>
             <w:tcBorders>
               <w:top w:val="single" w:sz="8" w:space="0" w:color="000000"/>
               <w:left w:val="single" w:sz="8" w:space="0" w:color="000000"/>
@@ -6334,7 +6472,7 @@
         </w:tc>
         <w:tc>
           <w:tcPr>
-            <w:tcW w:w="2248" w:type="dxa"/>
+            <w:tcW w:w="1927" w:type="dxa"/>
             <w:tcBorders>
               <w:top w:val="single" w:sz="8" w:space="0" w:color="000000"/>
               <w:left w:val="single" w:sz="8" w:space="0" w:color="000000"/>
@@ -6362,18 +6500,18 @@
         </w:tc>
         <w:tc>
           <w:tcPr>
-            <w:tcW w:w="3913" w:type="dxa"/>
-            <w:tcBorders>
-              <w:top w:val="single" w:sz="8" w:space="0" w:color="000000"/>
-              <w:left w:val="single" w:sz="8" w:space="0" w:color="000000"/>
-              <w:bottom w:val="single" w:sz="8" w:space="0" w:color="000000"/>
-              <w:right w:val="single" w:sz="8" w:space="0" w:color="000000"/>
-            </w:tcBorders>
-            <w:vAlign w:val="center"/>
-          </w:tcPr>
-          <w:p>
-            <w:pPr>
-              <w:jc w:val="both"/>
+            <w:tcW w:w="2835" w:type="dxa"/>
+            <w:tcBorders>
+              <w:top w:val="single" w:sz="8" w:space="0" w:color="000000"/>
+              <w:left w:val="single" w:sz="8" w:space="0" w:color="000000"/>
+              <w:bottom w:val="single" w:sz="8" w:space="0" w:color="000000"/>
+              <w:right w:val="single" w:sz="8" w:space="0" w:color="000000"/>
+            </w:tcBorders>
+            <w:vAlign w:val="center"/>
+          </w:tcPr>
+          <w:p>
+            <w:pPr>
+              <w:jc w:val="left"/>
               <w:rPr>
                 <w:sz w:val="24"/>
                 <w:szCs w:val="24"/>
@@ -6392,11 +6530,12 @@
       </w:tr>
       <w:tr>
         <w:trPr>
+          <w:cantSplit/>
           <w:jc w:val="center"/>
         </w:trPr>
         <w:tc>
           <w:tcPr>
-            <w:tcW w:w="3367" w:type="dxa"/>
+            <w:tcW w:w="4309" w:type="dxa"/>
             <w:tcBorders>
               <w:top w:val="single" w:sz="8" w:space="0" w:color="000000"/>
               <w:left w:val="single" w:sz="8" w:space="0" w:color="000000"/>
@@ -6424,7 +6563,7 @@
         </w:tc>
         <w:tc>
           <w:tcPr>
-            <w:tcW w:w="2248" w:type="dxa"/>
+            <w:tcW w:w="1927" w:type="dxa"/>
             <w:tcBorders>
               <w:top w:val="single" w:sz="8" w:space="0" w:color="000000"/>
               <w:left w:val="single" w:sz="8" w:space="0" w:color="000000"/>
@@ -6452,18 +6591,18 @@
         </w:tc>
         <w:tc>
           <w:tcPr>
-            <w:tcW w:w="3913" w:type="dxa"/>
-            <w:tcBorders>
-              <w:top w:val="single" w:sz="8" w:space="0" w:color="000000"/>
-              <w:left w:val="single" w:sz="8" w:space="0" w:color="000000"/>
-              <w:bottom w:val="single" w:sz="8" w:space="0" w:color="000000"/>
-              <w:right w:val="single" w:sz="8" w:space="0" w:color="000000"/>
-            </w:tcBorders>
-            <w:vAlign w:val="center"/>
-          </w:tcPr>
-          <w:p>
-            <w:pPr>
-              <w:jc w:val="both"/>
+            <w:tcW w:w="2835" w:type="dxa"/>
+            <w:tcBorders>
+              <w:top w:val="single" w:sz="8" w:space="0" w:color="000000"/>
+              <w:left w:val="single" w:sz="8" w:space="0" w:color="000000"/>
+              <w:bottom w:val="single" w:sz="8" w:space="0" w:color="000000"/>
+              <w:right w:val="single" w:sz="8" w:space="0" w:color="000000"/>
+            </w:tcBorders>
+            <w:vAlign w:val="center"/>
+          </w:tcPr>
+          <w:p>
+            <w:pPr>
+              <w:jc w:val="left"/>
               <w:rPr>
                 <w:sz w:val="24"/>
                 <w:szCs w:val="24"/>
@@ -6482,39 +6621,40 @@
       </w:tr>
       <w:tr>
         <w:trPr>
+          <w:cantSplit/>
           <w:jc w:val="center"/>
         </w:trPr>
         <w:tc>
           <w:tcPr>
-            <w:tcW w:w="3367" w:type="dxa"/>
-            <w:tcBorders>
-              <w:top w:val="single" w:sz="8" w:space="0" w:color="000000"/>
-              <w:left w:val="single" w:sz="8" w:space="0" w:color="000000"/>
-              <w:bottom w:val="single" w:sz="8" w:space="0" w:color="000000"/>
-              <w:right w:val="single" w:sz="8" w:space="0" w:color="000000"/>
-            </w:tcBorders>
-            <w:vAlign w:val="center"/>
-          </w:tcPr>
-          <w:p>
-            <w:pPr>
-              <w:rPr>
-                <w:sz w:val="24"/>
-                <w:szCs w:val="24"/>
-              </w:rPr>
-            </w:pPr>
-            <w:r>
-              <w:rPr>
-                <w:b w:val="0"/>
-                <w:sz w:val="24"/>
-                <w:szCs w:val="24"/>
-              </w:rPr>
-              <w:t>5. Rotasi kredensial yang terpapar segera.</w:t>
-            </w:r>
-          </w:p>
-        </w:tc>
-        <w:tc>
-          <w:tcPr>
-            <w:tcW w:w="2248" w:type="dxa"/>
+            <w:tcW w:w="4309" w:type="dxa"/>
+            <w:tcBorders>
+              <w:top w:val="single" w:sz="8" w:space="0" w:color="000000"/>
+              <w:left w:val="single" w:sz="8" w:space="0" w:color="000000"/>
+              <w:bottom w:val="single" w:sz="8" w:space="0" w:color="000000"/>
+              <w:right w:val="single" w:sz="8" w:space="0" w:color="000000"/>
+            </w:tcBorders>
+            <w:vAlign w:val="center"/>
+          </w:tcPr>
+          <w:p>
+            <w:pPr>
+              <w:rPr>
+                <w:sz w:val="24"/>
+                <w:szCs w:val="24"/>
+              </w:rPr>
+            </w:pPr>
+            <w:r>
+              <w:rPr>
+                <w:b w:val="0"/>
+                <w:sz w:val="24"/>
+                <w:szCs w:val="24"/>
+              </w:rPr>
+              <w:t>5. Rotasi segera kredensial yang terpapar.</w:t>
+            </w:r>
+          </w:p>
+        </w:tc>
+        <w:tc>
+          <w:tcPr>
+            <w:tcW w:w="1927" w:type="dxa"/>
             <w:tcBorders>
               <w:top w:val="single" w:sz="8" w:space="0" w:color="000000"/>
               <w:left w:val="single" w:sz="8" w:space="0" w:color="000000"/>
@@ -6542,18 +6682,18 @@
         </w:tc>
         <w:tc>
           <w:tcPr>
-            <w:tcW w:w="3913" w:type="dxa"/>
-            <w:tcBorders>
-              <w:top w:val="single" w:sz="8" w:space="0" w:color="000000"/>
-              <w:left w:val="single" w:sz="8" w:space="0" w:color="000000"/>
-              <w:bottom w:val="single" w:sz="8" w:space="0" w:color="000000"/>
-              <w:right w:val="single" w:sz="8" w:space="0" w:color="000000"/>
-            </w:tcBorders>
-            <w:vAlign w:val="center"/>
-          </w:tcPr>
-          <w:p>
-            <w:pPr>
-              <w:jc w:val="both"/>
+            <w:tcW w:w="2835" w:type="dxa"/>
+            <w:tcBorders>
+              <w:top w:val="single" w:sz="8" w:space="0" w:color="000000"/>
+              <w:left w:val="single" w:sz="8" w:space="0" w:color="000000"/>
+              <w:bottom w:val="single" w:sz="8" w:space="0" w:color="000000"/>
+              <w:right w:val="single" w:sz="8" w:space="0" w:color="000000"/>
+            </w:tcBorders>
+            <w:vAlign w:val="center"/>
+          </w:tcPr>
+          <w:p>
+            <w:pPr>
+              <w:jc w:val="left"/>
               <w:rPr>
                 <w:sz w:val="24"/>
                 <w:szCs w:val="24"/>
@@ -6598,6 +6738,7 @@
     <w:p>
       <w:pPr>
         <w:pStyle w:val="Heading2"/>
+        <w:keepNext/>
         <w:numPr>
           <w:ilvl w:val="1"/>
           <w:numId w:val="7"/>
@@ -6618,27 +6759,30 @@
         <w:tblLook w:val="0400" w:firstRow="0" w:lastRow="0" w:firstColumn="0" w:lastColumn="0" w:noHBand="0" w:noVBand="1"/>
       </w:tblPr>
       <w:tblGrid>
-        <w:gridCol w:w="3367"/>
-        <w:gridCol w:w="2248"/>
-        <w:gridCol w:w="3913"/>
+        <w:gridCol w:w="4309"/>
+        <w:gridCol w:w="1927"/>
+        <w:gridCol w:w="2835"/>
       </w:tblGrid>
       <w:tr>
         <w:trPr>
+          <w:cantSplit/>
+          <w:tblHeader/>
           <w:jc w:val="center"/>
         </w:trPr>
         <w:tc>
           <w:tcPr>
-            <w:tcW w:w="3367" w:type="dxa"/>
-            <w:tcBorders>
-              <w:top w:val="single" w:sz="8" w:space="0" w:color="000000"/>
-              <w:left w:val="single" w:sz="8" w:space="0" w:color="000000"/>
-              <w:bottom w:val="single" w:sz="8" w:space="0" w:color="000000"/>
-              <w:right w:val="single" w:sz="8" w:space="0" w:color="000000"/>
-            </w:tcBorders>
-            <w:vAlign w:val="center"/>
-          </w:tcPr>
-          <w:p>
-            <w:pPr>
+            <w:tcW w:w="4309" w:type="dxa"/>
+            <w:tcBorders>
+              <w:top w:val="single" w:sz="8" w:space="0" w:color="000000"/>
+              <w:left w:val="single" w:sz="8" w:space="0" w:color="000000"/>
+              <w:bottom w:val="single" w:sz="8" w:space="0" w:color="000000"/>
+              <w:right w:val="single" w:sz="8" w:space="0" w:color="000000"/>
+            </w:tcBorders>
+            <w:vAlign w:val="center"/>
+          </w:tcPr>
+          <w:p>
+            <w:pPr>
+              <w:keepNext/>
               <w:jc w:val="center"/>
               <w:rPr>
                 <w:sz w:val="24"/>
@@ -6658,17 +6802,18 @@
         </w:tc>
         <w:tc>
           <w:tcPr>
-            <w:tcW w:w="2248" w:type="dxa"/>
-            <w:tcBorders>
-              <w:top w:val="single" w:sz="8" w:space="0" w:color="000000"/>
-              <w:left w:val="single" w:sz="8" w:space="0" w:color="000000"/>
-              <w:bottom w:val="single" w:sz="8" w:space="0" w:color="000000"/>
-              <w:right w:val="single" w:sz="8" w:space="0" w:color="000000"/>
-            </w:tcBorders>
-            <w:vAlign w:val="center"/>
-          </w:tcPr>
-          <w:p>
-            <w:pPr>
+            <w:tcW w:w="1927" w:type="dxa"/>
+            <w:tcBorders>
+              <w:top w:val="single" w:sz="8" w:space="0" w:color="000000"/>
+              <w:left w:val="single" w:sz="8" w:space="0" w:color="000000"/>
+              <w:bottom w:val="single" w:sz="8" w:space="0" w:color="000000"/>
+              <w:right w:val="single" w:sz="8" w:space="0" w:color="000000"/>
+            </w:tcBorders>
+            <w:vAlign w:val="center"/>
+          </w:tcPr>
+          <w:p>
+            <w:pPr>
+              <w:keepNext/>
               <w:jc w:val="center"/>
               <w:rPr>
                 <w:sz w:val="24"/>
@@ -6688,17 +6833,18 @@
         </w:tc>
         <w:tc>
           <w:tcPr>
-            <w:tcW w:w="3913" w:type="dxa"/>
-            <w:tcBorders>
-              <w:top w:val="single" w:sz="8" w:space="0" w:color="000000"/>
-              <w:left w:val="single" w:sz="8" w:space="0" w:color="000000"/>
-              <w:bottom w:val="single" w:sz="8" w:space="0" w:color="000000"/>
-              <w:right w:val="single" w:sz="8" w:space="0" w:color="000000"/>
-            </w:tcBorders>
-            <w:vAlign w:val="center"/>
-          </w:tcPr>
-          <w:p>
-            <w:pPr>
+            <w:tcW w:w="2835" w:type="dxa"/>
+            <w:tcBorders>
+              <w:top w:val="single" w:sz="8" w:space="0" w:color="000000"/>
+              <w:left w:val="single" w:sz="8" w:space="0" w:color="000000"/>
+              <w:bottom w:val="single" w:sz="8" w:space="0" w:color="000000"/>
+              <w:right w:val="single" w:sz="8" w:space="0" w:color="000000"/>
+            </w:tcBorders>
+            <w:vAlign w:val="center"/>
+          </w:tcPr>
+          <w:p>
+            <w:pPr>
+              <w:keepNext/>
               <w:jc w:val="center"/>
               <w:rPr>
                 <w:sz w:val="24"/>
@@ -6719,11 +6865,12 @@
       </w:tr>
       <w:tr>
         <w:trPr>
+          <w:cantSplit/>
           <w:jc w:val="center"/>
         </w:trPr>
         <w:tc>
           <w:tcPr>
-            <w:tcW w:w="3367" w:type="dxa"/>
+            <w:tcW w:w="4309" w:type="dxa"/>
             <w:tcBorders>
               <w:top w:val="single" w:sz="8" w:space="0" w:color="000000"/>
               <w:left w:val="single" w:sz="8" w:space="0" w:color="000000"/>
@@ -6751,7 +6898,7 @@
         </w:tc>
         <w:tc>
           <w:tcPr>
-            <w:tcW w:w="2248" w:type="dxa"/>
+            <w:tcW w:w="1927" w:type="dxa"/>
             <w:tcBorders>
               <w:top w:val="single" w:sz="8" w:space="0" w:color="000000"/>
               <w:left w:val="single" w:sz="8" w:space="0" w:color="000000"/>
@@ -6779,18 +6926,18 @@
         </w:tc>
         <w:tc>
           <w:tcPr>
-            <w:tcW w:w="3913" w:type="dxa"/>
-            <w:tcBorders>
-              <w:top w:val="single" w:sz="8" w:space="0" w:color="000000"/>
-              <w:left w:val="single" w:sz="8" w:space="0" w:color="000000"/>
-              <w:bottom w:val="single" w:sz="8" w:space="0" w:color="000000"/>
-              <w:right w:val="single" w:sz="8" w:space="0" w:color="000000"/>
-            </w:tcBorders>
-            <w:vAlign w:val="center"/>
-          </w:tcPr>
-          <w:p>
-            <w:pPr>
-              <w:jc w:val="both"/>
+            <w:tcW w:w="2835" w:type="dxa"/>
+            <w:tcBorders>
+              <w:top w:val="single" w:sz="8" w:space="0" w:color="000000"/>
+              <w:left w:val="single" w:sz="8" w:space="0" w:color="000000"/>
+              <w:bottom w:val="single" w:sz="8" w:space="0" w:color="000000"/>
+              <w:right w:val="single" w:sz="8" w:space="0" w:color="000000"/>
+            </w:tcBorders>
+            <w:vAlign w:val="center"/>
+          </w:tcPr>
+          <w:p>
+            <w:pPr>
+              <w:jc w:val="left"/>
               <w:rPr>
                 <w:sz w:val="24"/>
                 <w:szCs w:val="24"/>
@@ -6809,11 +6956,12 @@
       </w:tr>
       <w:tr>
         <w:trPr>
+          <w:cantSplit/>
           <w:jc w:val="center"/>
         </w:trPr>
         <w:tc>
           <w:tcPr>
-            <w:tcW w:w="3367" w:type="dxa"/>
+            <w:tcW w:w="4309" w:type="dxa"/>
             <w:tcBorders>
               <w:top w:val="single" w:sz="8" w:space="0" w:color="000000"/>
               <w:left w:val="single" w:sz="8" w:space="0" w:color="000000"/>
@@ -6841,7 +6989,7 @@
         </w:tc>
         <w:tc>
           <w:tcPr>
-            <w:tcW w:w="2248" w:type="dxa"/>
+            <w:tcW w:w="1927" w:type="dxa"/>
             <w:tcBorders>
               <w:top w:val="single" w:sz="8" w:space="0" w:color="000000"/>
               <w:left w:val="single" w:sz="8" w:space="0" w:color="000000"/>
@@ -6869,18 +7017,18 @@
         </w:tc>
         <w:tc>
           <w:tcPr>
-            <w:tcW w:w="3913" w:type="dxa"/>
-            <w:tcBorders>
-              <w:top w:val="single" w:sz="8" w:space="0" w:color="000000"/>
-              <w:left w:val="single" w:sz="8" w:space="0" w:color="000000"/>
-              <w:bottom w:val="single" w:sz="8" w:space="0" w:color="000000"/>
-              <w:right w:val="single" w:sz="8" w:space="0" w:color="000000"/>
-            </w:tcBorders>
-            <w:vAlign w:val="center"/>
-          </w:tcPr>
-          <w:p>
-            <w:pPr>
-              <w:jc w:val="both"/>
+            <w:tcW w:w="2835" w:type="dxa"/>
+            <w:tcBorders>
+              <w:top w:val="single" w:sz="8" w:space="0" w:color="000000"/>
+              <w:left w:val="single" w:sz="8" w:space="0" w:color="000000"/>
+              <w:bottom w:val="single" w:sz="8" w:space="0" w:color="000000"/>
+              <w:right w:val="single" w:sz="8" w:space="0" w:color="000000"/>
+            </w:tcBorders>
+            <w:vAlign w:val="center"/>
+          </w:tcPr>
+          <w:p>
+            <w:pPr>
+              <w:jc w:val="left"/>
               <w:rPr>
                 <w:sz w:val="24"/>
                 <w:szCs w:val="24"/>
@@ -6899,11 +7047,12 @@
       </w:tr>
       <w:tr>
         <w:trPr>
+          <w:cantSplit/>
           <w:jc w:val="center"/>
         </w:trPr>
         <w:tc>
           <w:tcPr>
-            <w:tcW w:w="3367" w:type="dxa"/>
+            <w:tcW w:w="4309" w:type="dxa"/>
             <w:tcBorders>
               <w:top w:val="single" w:sz="8" w:space="0" w:color="000000"/>
               <w:left w:val="single" w:sz="8" w:space="0" w:color="000000"/>
@@ -6931,7 +7080,7 @@
         </w:tc>
         <w:tc>
           <w:tcPr>
-            <w:tcW w:w="2248" w:type="dxa"/>
+            <w:tcW w:w="1927" w:type="dxa"/>
             <w:tcBorders>
               <w:top w:val="single" w:sz="8" w:space="0" w:color="000000"/>
               <w:left w:val="single" w:sz="8" w:space="0" w:color="000000"/>
@@ -6959,18 +7108,18 @@
         </w:tc>
         <w:tc>
           <w:tcPr>
-            <w:tcW w:w="3913" w:type="dxa"/>
-            <w:tcBorders>
-              <w:top w:val="single" w:sz="8" w:space="0" w:color="000000"/>
-              <w:left w:val="single" w:sz="8" w:space="0" w:color="000000"/>
-              <w:bottom w:val="single" w:sz="8" w:space="0" w:color="000000"/>
-              <w:right w:val="single" w:sz="8" w:space="0" w:color="000000"/>
-            </w:tcBorders>
-            <w:vAlign w:val="center"/>
-          </w:tcPr>
-          <w:p>
-            <w:pPr>
-              <w:jc w:val="both"/>
+            <w:tcW w:w="2835" w:type="dxa"/>
+            <w:tcBorders>
+              <w:top w:val="single" w:sz="8" w:space="0" w:color="000000"/>
+              <w:left w:val="single" w:sz="8" w:space="0" w:color="000000"/>
+              <w:bottom w:val="single" w:sz="8" w:space="0" w:color="000000"/>
+              <w:right w:val="single" w:sz="8" w:space="0" w:color="000000"/>
+            </w:tcBorders>
+            <w:vAlign w:val="center"/>
+          </w:tcPr>
+          <w:p>
+            <w:pPr>
+              <w:jc w:val="left"/>
               <w:rPr>
                 <w:sz w:val="24"/>
                 <w:szCs w:val="24"/>
@@ -7015,6 +7164,7 @@
     <w:p>
       <w:pPr>
         <w:pStyle w:val="Heading2"/>
+        <w:keepNext/>
         <w:numPr>
           <w:ilvl w:val="1"/>
           <w:numId w:val="7"/>
@@ -7035,27 +7185,30 @@
         <w:tblLook w:val="0400" w:firstRow="0" w:lastRow="0" w:firstColumn="0" w:lastColumn="0" w:noHBand="0" w:noVBand="1"/>
       </w:tblPr>
       <w:tblGrid>
-        <w:gridCol w:w="3367"/>
-        <w:gridCol w:w="2248"/>
-        <w:gridCol w:w="3913"/>
+        <w:gridCol w:w="4309"/>
+        <w:gridCol w:w="1927"/>
+        <w:gridCol w:w="2835"/>
       </w:tblGrid>
       <w:tr>
         <w:trPr>
+          <w:cantSplit/>
+          <w:tblHeader/>
           <w:jc w:val="center"/>
         </w:trPr>
         <w:tc>
           <w:tcPr>
-            <w:tcW w:w="3367" w:type="dxa"/>
-            <w:tcBorders>
-              <w:top w:val="single" w:sz="8" w:space="0" w:color="000000"/>
-              <w:left w:val="single" w:sz="8" w:space="0" w:color="000000"/>
-              <w:bottom w:val="single" w:sz="8" w:space="0" w:color="000000"/>
-              <w:right w:val="single" w:sz="8" w:space="0" w:color="000000"/>
-            </w:tcBorders>
-            <w:vAlign w:val="center"/>
-          </w:tcPr>
-          <w:p>
-            <w:pPr>
+            <w:tcW w:w="4309" w:type="dxa"/>
+            <w:tcBorders>
+              <w:top w:val="single" w:sz="8" w:space="0" w:color="000000"/>
+              <w:left w:val="single" w:sz="8" w:space="0" w:color="000000"/>
+              <w:bottom w:val="single" w:sz="8" w:space="0" w:color="000000"/>
+              <w:right w:val="single" w:sz="8" w:space="0" w:color="000000"/>
+            </w:tcBorders>
+            <w:vAlign w:val="center"/>
+          </w:tcPr>
+          <w:p>
+            <w:pPr>
+              <w:keepNext/>
               <w:jc w:val="center"/>
               <w:rPr>
                 <w:sz w:val="24"/>
@@ -7075,17 +7228,18 @@
         </w:tc>
         <w:tc>
           <w:tcPr>
-            <w:tcW w:w="2248" w:type="dxa"/>
-            <w:tcBorders>
-              <w:top w:val="single" w:sz="8" w:space="0" w:color="000000"/>
-              <w:left w:val="single" w:sz="8" w:space="0" w:color="000000"/>
-              <w:bottom w:val="single" w:sz="8" w:space="0" w:color="000000"/>
-              <w:right w:val="single" w:sz="8" w:space="0" w:color="000000"/>
-            </w:tcBorders>
-            <w:vAlign w:val="center"/>
-          </w:tcPr>
-          <w:p>
-            <w:pPr>
+            <w:tcW w:w="1927" w:type="dxa"/>
+            <w:tcBorders>
+              <w:top w:val="single" w:sz="8" w:space="0" w:color="000000"/>
+              <w:left w:val="single" w:sz="8" w:space="0" w:color="000000"/>
+              <w:bottom w:val="single" w:sz="8" w:space="0" w:color="000000"/>
+              <w:right w:val="single" w:sz="8" w:space="0" w:color="000000"/>
+            </w:tcBorders>
+            <w:vAlign w:val="center"/>
+          </w:tcPr>
+          <w:p>
+            <w:pPr>
+              <w:keepNext/>
               <w:jc w:val="center"/>
               <w:rPr>
                 <w:sz w:val="24"/>
@@ -7105,17 +7259,18 @@
         </w:tc>
         <w:tc>
           <w:tcPr>
-            <w:tcW w:w="3913" w:type="dxa"/>
-            <w:tcBorders>
-              <w:top w:val="single" w:sz="8" w:space="0" w:color="000000"/>
-              <w:left w:val="single" w:sz="8" w:space="0" w:color="000000"/>
-              <w:bottom w:val="single" w:sz="8" w:space="0" w:color="000000"/>
-              <w:right w:val="single" w:sz="8" w:space="0" w:color="000000"/>
-            </w:tcBorders>
-            <w:vAlign w:val="center"/>
-          </w:tcPr>
-          <w:p>
-            <w:pPr>
+            <w:tcW w:w="2835" w:type="dxa"/>
+            <w:tcBorders>
+              <w:top w:val="single" w:sz="8" w:space="0" w:color="000000"/>
+              <w:left w:val="single" w:sz="8" w:space="0" w:color="000000"/>
+              <w:bottom w:val="single" w:sz="8" w:space="0" w:color="000000"/>
+              <w:right w:val="single" w:sz="8" w:space="0" w:color="000000"/>
+            </w:tcBorders>
+            <w:vAlign w:val="center"/>
+          </w:tcPr>
+          <w:p>
+            <w:pPr>
+              <w:keepNext/>
               <w:jc w:val="center"/>
               <w:rPr>
                 <w:sz w:val="24"/>
@@ -7136,11 +7291,12 @@
       </w:tr>
       <w:tr>
         <w:trPr>
+          <w:cantSplit/>
           <w:jc w:val="center"/>
         </w:trPr>
         <w:tc>
           <w:tcPr>
-            <w:tcW w:w="3367" w:type="dxa"/>
+            <w:tcW w:w="4309" w:type="dxa"/>
             <w:tcBorders>
               <w:top w:val="single" w:sz="8" w:space="0" w:color="000000"/>
               <w:left w:val="single" w:sz="8" w:space="0" w:color="000000"/>
@@ -7168,7 +7324,7 @@
         </w:tc>
         <w:tc>
           <w:tcPr>
-            <w:tcW w:w="2248" w:type="dxa"/>
+            <w:tcW w:w="1927" w:type="dxa"/>
             <w:tcBorders>
               <w:top w:val="single" w:sz="8" w:space="0" w:color="000000"/>
               <w:left w:val="single" w:sz="8" w:space="0" w:color="000000"/>
@@ -7196,18 +7352,18 @@
         </w:tc>
         <w:tc>
           <w:tcPr>
-            <w:tcW w:w="3913" w:type="dxa"/>
-            <w:tcBorders>
-              <w:top w:val="single" w:sz="8" w:space="0" w:color="000000"/>
-              <w:left w:val="single" w:sz="8" w:space="0" w:color="000000"/>
-              <w:bottom w:val="single" w:sz="8" w:space="0" w:color="000000"/>
-              <w:right w:val="single" w:sz="8" w:space="0" w:color="000000"/>
-            </w:tcBorders>
-            <w:vAlign w:val="center"/>
-          </w:tcPr>
-          <w:p>
-            <w:pPr>
-              <w:jc w:val="both"/>
+            <w:tcW w:w="2835" w:type="dxa"/>
+            <w:tcBorders>
+              <w:top w:val="single" w:sz="8" w:space="0" w:color="000000"/>
+              <w:left w:val="single" w:sz="8" w:space="0" w:color="000000"/>
+              <w:bottom w:val="single" w:sz="8" w:space="0" w:color="000000"/>
+              <w:right w:val="single" w:sz="8" w:space="0" w:color="000000"/>
+            </w:tcBorders>
+            <w:vAlign w:val="center"/>
+          </w:tcPr>
+          <w:p>
+            <w:pPr>
+              <w:jc w:val="left"/>
               <w:rPr>
                 <w:sz w:val="24"/>
                 <w:szCs w:val="24"/>
@@ -7226,11 +7382,12 @@
       </w:tr>
       <w:tr>
         <w:trPr>
+          <w:cantSplit/>
           <w:jc w:val="center"/>
         </w:trPr>
         <w:tc>
           <w:tcPr>
-            <w:tcW w:w="3367" w:type="dxa"/>
+            <w:tcW w:w="4309" w:type="dxa"/>
             <w:tcBorders>
               <w:top w:val="single" w:sz="8" w:space="0" w:color="000000"/>
               <w:left w:val="single" w:sz="8" w:space="0" w:color="000000"/>
@@ -7258,7 +7415,7 @@
         </w:tc>
         <w:tc>
           <w:tcPr>
-            <w:tcW w:w="2248" w:type="dxa"/>
+            <w:tcW w:w="1927" w:type="dxa"/>
             <w:tcBorders>
               <w:top w:val="single" w:sz="8" w:space="0" w:color="000000"/>
               <w:left w:val="single" w:sz="8" w:space="0" w:color="000000"/>
@@ -7286,18 +7443,18 @@
         </w:tc>
         <w:tc>
           <w:tcPr>
-            <w:tcW w:w="3913" w:type="dxa"/>
-            <w:tcBorders>
-              <w:top w:val="single" w:sz="8" w:space="0" w:color="000000"/>
-              <w:left w:val="single" w:sz="8" w:space="0" w:color="000000"/>
-              <w:bottom w:val="single" w:sz="8" w:space="0" w:color="000000"/>
-              <w:right w:val="single" w:sz="8" w:space="0" w:color="000000"/>
-            </w:tcBorders>
-            <w:vAlign w:val="center"/>
-          </w:tcPr>
-          <w:p>
-            <w:pPr>
-              <w:jc w:val="both"/>
+            <w:tcW w:w="2835" w:type="dxa"/>
+            <w:tcBorders>
+              <w:top w:val="single" w:sz="8" w:space="0" w:color="000000"/>
+              <w:left w:val="single" w:sz="8" w:space="0" w:color="000000"/>
+              <w:bottom w:val="single" w:sz="8" w:space="0" w:color="000000"/>
+              <w:right w:val="single" w:sz="8" w:space="0" w:color="000000"/>
+            </w:tcBorders>
+            <w:vAlign w:val="center"/>
+          </w:tcPr>
+          <w:p>
+            <w:pPr>
+              <w:jc w:val="left"/>
               <w:rPr>
                 <w:sz w:val="24"/>
                 <w:szCs w:val="24"/>
@@ -7316,39 +7473,40 @@
       </w:tr>
       <w:tr>
         <w:trPr>
+          <w:cantSplit/>
           <w:jc w:val="center"/>
         </w:trPr>
         <w:tc>
           <w:tcPr>
-            <w:tcW w:w="3367" w:type="dxa"/>
-            <w:tcBorders>
-              <w:top w:val="single" w:sz="8" w:space="0" w:color="000000"/>
-              <w:left w:val="single" w:sz="8" w:space="0" w:color="000000"/>
-              <w:bottom w:val="single" w:sz="8" w:space="0" w:color="000000"/>
-              <w:right w:val="single" w:sz="8" w:space="0" w:color="000000"/>
-            </w:tcBorders>
-            <w:vAlign w:val="center"/>
-          </w:tcPr>
-          <w:p>
-            <w:pPr>
-              <w:rPr>
-                <w:sz w:val="24"/>
-                <w:szCs w:val="24"/>
-              </w:rPr>
-            </w:pPr>
-            <w:r>
-              <w:rPr>
-                <w:b w:val="0"/>
-                <w:sz w:val="24"/>
-                <w:szCs w:val="24"/>
-              </w:rPr>
-              <w:t>3. Cabut akses lama yang tidak relevan paling lambat 5 hari kerja sesudah mutasi.</w:t>
-            </w:r>
-          </w:p>
-        </w:tc>
-        <w:tc>
-          <w:tcPr>
-            <w:tcW w:w="2248" w:type="dxa"/>
+            <w:tcW w:w="4309" w:type="dxa"/>
+            <w:tcBorders>
+              <w:top w:val="single" w:sz="8" w:space="0" w:color="000000"/>
+              <w:left w:val="single" w:sz="8" w:space="0" w:color="000000"/>
+              <w:bottom w:val="single" w:sz="8" w:space="0" w:color="000000"/>
+              <w:right w:val="single" w:sz="8" w:space="0" w:color="000000"/>
+            </w:tcBorders>
+            <w:vAlign w:val="center"/>
+          </w:tcPr>
+          <w:p>
+            <w:pPr>
+              <w:rPr>
+                <w:sz w:val="24"/>
+                <w:szCs w:val="24"/>
+              </w:rPr>
+            </w:pPr>
+            <w:r>
+              <w:rPr>
+                <w:b w:val="0"/>
+                <w:sz w:val="24"/>
+                <w:szCs w:val="24"/>
+              </w:rPr>
+              <w:t>3. Cabut akses lama yang tidak relevan paling lambat 5 hari kerja setelah mutasi.</w:t>
+            </w:r>
+          </w:p>
+        </w:tc>
+        <w:tc>
+          <w:tcPr>
+            <w:tcW w:w="1927" w:type="dxa"/>
             <w:tcBorders>
               <w:top w:val="single" w:sz="8" w:space="0" w:color="000000"/>
               <w:left w:val="single" w:sz="8" w:space="0" w:color="000000"/>
@@ -7376,18 +7534,18 @@
         </w:tc>
         <w:tc>
           <w:tcPr>
-            <w:tcW w:w="3913" w:type="dxa"/>
-            <w:tcBorders>
-              <w:top w:val="single" w:sz="8" w:space="0" w:color="000000"/>
-              <w:left w:val="single" w:sz="8" w:space="0" w:color="000000"/>
-              <w:bottom w:val="single" w:sz="8" w:space="0" w:color="000000"/>
-              <w:right w:val="single" w:sz="8" w:space="0" w:color="000000"/>
-            </w:tcBorders>
-            <w:vAlign w:val="center"/>
-          </w:tcPr>
-          <w:p>
-            <w:pPr>
-              <w:jc w:val="both"/>
+            <w:tcW w:w="2835" w:type="dxa"/>
+            <w:tcBorders>
+              <w:top w:val="single" w:sz="8" w:space="0" w:color="000000"/>
+              <w:left w:val="single" w:sz="8" w:space="0" w:color="000000"/>
+              <w:bottom w:val="single" w:sz="8" w:space="0" w:color="000000"/>
+              <w:right w:val="single" w:sz="8" w:space="0" w:color="000000"/>
+            </w:tcBorders>
+            <w:vAlign w:val="center"/>
+          </w:tcPr>
+          <w:p>
+            <w:pPr>
+              <w:jc w:val="left"/>
               <w:rPr>
                 <w:sz w:val="24"/>
                 <w:szCs w:val="24"/>
@@ -7432,6 +7590,7 @@
     <w:p>
       <w:pPr>
         <w:pStyle w:val="Heading2"/>
+        <w:keepNext/>
         <w:numPr>
           <w:ilvl w:val="1"/>
           <w:numId w:val="7"/>
@@ -7452,27 +7611,30 @@
         <w:tblLook w:val="0400" w:firstRow="0" w:lastRow="0" w:firstColumn="0" w:lastColumn="0" w:noHBand="0" w:noVBand="1"/>
       </w:tblPr>
       <w:tblGrid>
-        <w:gridCol w:w="3367"/>
-        <w:gridCol w:w="2248"/>
-        <w:gridCol w:w="3913"/>
+        <w:gridCol w:w="4309"/>
+        <w:gridCol w:w="1927"/>
+        <w:gridCol w:w="2835"/>
       </w:tblGrid>
       <w:tr>
         <w:trPr>
+          <w:cantSplit/>
+          <w:tblHeader/>
           <w:jc w:val="center"/>
         </w:trPr>
         <w:tc>
           <w:tcPr>
-            <w:tcW w:w="3367" w:type="dxa"/>
-            <w:tcBorders>
-              <w:top w:val="single" w:sz="8" w:space="0" w:color="000000"/>
-              <w:left w:val="single" w:sz="8" w:space="0" w:color="000000"/>
-              <w:bottom w:val="single" w:sz="8" w:space="0" w:color="000000"/>
-              <w:right w:val="single" w:sz="8" w:space="0" w:color="000000"/>
-            </w:tcBorders>
-            <w:vAlign w:val="center"/>
-          </w:tcPr>
-          <w:p>
-            <w:pPr>
+            <w:tcW w:w="4309" w:type="dxa"/>
+            <w:tcBorders>
+              <w:top w:val="single" w:sz="8" w:space="0" w:color="000000"/>
+              <w:left w:val="single" w:sz="8" w:space="0" w:color="000000"/>
+              <w:bottom w:val="single" w:sz="8" w:space="0" w:color="000000"/>
+              <w:right w:val="single" w:sz="8" w:space="0" w:color="000000"/>
+            </w:tcBorders>
+            <w:vAlign w:val="center"/>
+          </w:tcPr>
+          <w:p>
+            <w:pPr>
+              <w:keepNext/>
               <w:jc w:val="center"/>
               <w:rPr>
                 <w:sz w:val="24"/>
@@ -7492,17 +7654,18 @@
         </w:tc>
         <w:tc>
           <w:tcPr>
-            <w:tcW w:w="2248" w:type="dxa"/>
-            <w:tcBorders>
-              <w:top w:val="single" w:sz="8" w:space="0" w:color="000000"/>
-              <w:left w:val="single" w:sz="8" w:space="0" w:color="000000"/>
-              <w:bottom w:val="single" w:sz="8" w:space="0" w:color="000000"/>
-              <w:right w:val="single" w:sz="8" w:space="0" w:color="000000"/>
-            </w:tcBorders>
-            <w:vAlign w:val="center"/>
-          </w:tcPr>
-          <w:p>
-            <w:pPr>
+            <w:tcW w:w="1927" w:type="dxa"/>
+            <w:tcBorders>
+              <w:top w:val="single" w:sz="8" w:space="0" w:color="000000"/>
+              <w:left w:val="single" w:sz="8" w:space="0" w:color="000000"/>
+              <w:bottom w:val="single" w:sz="8" w:space="0" w:color="000000"/>
+              <w:right w:val="single" w:sz="8" w:space="0" w:color="000000"/>
+            </w:tcBorders>
+            <w:vAlign w:val="center"/>
+          </w:tcPr>
+          <w:p>
+            <w:pPr>
+              <w:keepNext/>
               <w:jc w:val="center"/>
               <w:rPr>
                 <w:sz w:val="24"/>
@@ -7522,17 +7685,18 @@
         </w:tc>
         <w:tc>
           <w:tcPr>
-            <w:tcW w:w="3913" w:type="dxa"/>
-            <w:tcBorders>
-              <w:top w:val="single" w:sz="8" w:space="0" w:color="000000"/>
-              <w:left w:val="single" w:sz="8" w:space="0" w:color="000000"/>
-              <w:bottom w:val="single" w:sz="8" w:space="0" w:color="000000"/>
-              <w:right w:val="single" w:sz="8" w:space="0" w:color="000000"/>
-            </w:tcBorders>
-            <w:vAlign w:val="center"/>
-          </w:tcPr>
-          <w:p>
-            <w:pPr>
+            <w:tcW w:w="2835" w:type="dxa"/>
+            <w:tcBorders>
+              <w:top w:val="single" w:sz="8" w:space="0" w:color="000000"/>
+              <w:left w:val="single" w:sz="8" w:space="0" w:color="000000"/>
+              <w:bottom w:val="single" w:sz="8" w:space="0" w:color="000000"/>
+              <w:right w:val="single" w:sz="8" w:space="0" w:color="000000"/>
+            </w:tcBorders>
+            <w:vAlign w:val="center"/>
+          </w:tcPr>
+          <w:p>
+            <w:pPr>
+              <w:keepNext/>
               <w:jc w:val="center"/>
               <w:rPr>
                 <w:sz w:val="24"/>
@@ -7553,11 +7717,12 @@
       </w:tr>
       <w:tr>
         <w:trPr>
+          <w:cantSplit/>
           <w:jc w:val="center"/>
         </w:trPr>
         <w:tc>
           <w:tcPr>
-            <w:tcW w:w="3367" w:type="dxa"/>
+            <w:tcW w:w="4309" w:type="dxa"/>
             <w:tcBorders>
               <w:top w:val="single" w:sz="8" w:space="0" w:color="000000"/>
               <w:left w:val="single" w:sz="8" w:space="0" w:color="000000"/>
@@ -7585,7 +7750,7 @@
         </w:tc>
         <w:tc>
           <w:tcPr>
-            <w:tcW w:w="2248" w:type="dxa"/>
+            <w:tcW w:w="1927" w:type="dxa"/>
             <w:tcBorders>
               <w:top w:val="single" w:sz="8" w:space="0" w:color="000000"/>
               <w:left w:val="single" w:sz="8" w:space="0" w:color="000000"/>
@@ -7613,18 +7778,18 @@
         </w:tc>
         <w:tc>
           <w:tcPr>
-            <w:tcW w:w="3913" w:type="dxa"/>
-            <w:tcBorders>
-              <w:top w:val="single" w:sz="8" w:space="0" w:color="000000"/>
-              <w:left w:val="single" w:sz="8" w:space="0" w:color="000000"/>
-              <w:bottom w:val="single" w:sz="8" w:space="0" w:color="000000"/>
-              <w:right w:val="single" w:sz="8" w:space="0" w:color="000000"/>
-            </w:tcBorders>
-            <w:vAlign w:val="center"/>
-          </w:tcPr>
-          <w:p>
-            <w:pPr>
-              <w:jc w:val="both"/>
+            <w:tcW w:w="2835" w:type="dxa"/>
+            <w:tcBorders>
+              <w:top w:val="single" w:sz="8" w:space="0" w:color="000000"/>
+              <w:left w:val="single" w:sz="8" w:space="0" w:color="000000"/>
+              <w:bottom w:val="single" w:sz="8" w:space="0" w:color="000000"/>
+              <w:right w:val="single" w:sz="8" w:space="0" w:color="000000"/>
+            </w:tcBorders>
+            <w:vAlign w:val="center"/>
+          </w:tcPr>
+          <w:p>
+            <w:pPr>
+              <w:jc w:val="left"/>
               <w:rPr>
                 <w:sz w:val="24"/>
                 <w:szCs w:val="24"/>
@@ -7643,11 +7808,12 @@
       </w:tr>
       <w:tr>
         <w:trPr>
+          <w:cantSplit/>
           <w:jc w:val="center"/>
         </w:trPr>
         <w:tc>
           <w:tcPr>
-            <w:tcW w:w="3367" w:type="dxa"/>
+            <w:tcW w:w="4309" w:type="dxa"/>
             <w:tcBorders>
               <w:top w:val="single" w:sz="8" w:space="0" w:color="000000"/>
               <w:left w:val="single" w:sz="8" w:space="0" w:color="000000"/>
@@ -7675,7 +7841,7 @@
         </w:tc>
         <w:tc>
           <w:tcPr>
-            <w:tcW w:w="2248" w:type="dxa"/>
+            <w:tcW w:w="1927" w:type="dxa"/>
             <w:tcBorders>
               <w:top w:val="single" w:sz="8" w:space="0" w:color="000000"/>
               <w:left w:val="single" w:sz="8" w:space="0" w:color="000000"/>
@@ -7703,18 +7869,18 @@
         </w:tc>
         <w:tc>
           <w:tcPr>
-            <w:tcW w:w="3913" w:type="dxa"/>
-            <w:tcBorders>
-              <w:top w:val="single" w:sz="8" w:space="0" w:color="000000"/>
-              <w:left w:val="single" w:sz="8" w:space="0" w:color="000000"/>
-              <w:bottom w:val="single" w:sz="8" w:space="0" w:color="000000"/>
-              <w:right w:val="single" w:sz="8" w:space="0" w:color="000000"/>
-            </w:tcBorders>
-            <w:vAlign w:val="center"/>
-          </w:tcPr>
-          <w:p>
-            <w:pPr>
-              <w:jc w:val="both"/>
+            <w:tcW w:w="2835" w:type="dxa"/>
+            <w:tcBorders>
+              <w:top w:val="single" w:sz="8" w:space="0" w:color="000000"/>
+              <w:left w:val="single" w:sz="8" w:space="0" w:color="000000"/>
+              <w:bottom w:val="single" w:sz="8" w:space="0" w:color="000000"/>
+              <w:right w:val="single" w:sz="8" w:space="0" w:color="000000"/>
+            </w:tcBorders>
+            <w:vAlign w:val="center"/>
+          </w:tcPr>
+          <w:p>
+            <w:pPr>
+              <w:jc w:val="left"/>
               <w:rPr>
                 <w:sz w:val="24"/>
                 <w:szCs w:val="24"/>
@@ -7733,11 +7899,12 @@
       </w:tr>
       <w:tr>
         <w:trPr>
+          <w:cantSplit/>
           <w:jc w:val="center"/>
         </w:trPr>
         <w:tc>
           <w:tcPr>
-            <w:tcW w:w="3367" w:type="dxa"/>
+            <w:tcW w:w="4309" w:type="dxa"/>
             <w:tcBorders>
               <w:top w:val="single" w:sz="8" w:space="0" w:color="000000"/>
               <w:left w:val="single" w:sz="8" w:space="0" w:color="000000"/>
@@ -7765,7 +7932,7 @@
         </w:tc>
         <w:tc>
           <w:tcPr>
-            <w:tcW w:w="2248" w:type="dxa"/>
+            <w:tcW w:w="1927" w:type="dxa"/>
             <w:tcBorders>
               <w:top w:val="single" w:sz="8" w:space="0" w:color="000000"/>
               <w:left w:val="single" w:sz="8" w:space="0" w:color="000000"/>
@@ -7793,18 +7960,18 @@
         </w:tc>
         <w:tc>
           <w:tcPr>
-            <w:tcW w:w="3913" w:type="dxa"/>
-            <w:tcBorders>
-              <w:top w:val="single" w:sz="8" w:space="0" w:color="000000"/>
-              <w:left w:val="single" w:sz="8" w:space="0" w:color="000000"/>
-              <w:bottom w:val="single" w:sz="8" w:space="0" w:color="000000"/>
-              <w:right w:val="single" w:sz="8" w:space="0" w:color="000000"/>
-            </w:tcBorders>
-            <w:vAlign w:val="center"/>
-          </w:tcPr>
-          <w:p>
-            <w:pPr>
-              <w:jc w:val="both"/>
+            <w:tcW w:w="2835" w:type="dxa"/>
+            <w:tcBorders>
+              <w:top w:val="single" w:sz="8" w:space="0" w:color="000000"/>
+              <w:left w:val="single" w:sz="8" w:space="0" w:color="000000"/>
+              <w:bottom w:val="single" w:sz="8" w:space="0" w:color="000000"/>
+              <w:right w:val="single" w:sz="8" w:space="0" w:color="000000"/>
+            </w:tcBorders>
+            <w:vAlign w:val="center"/>
+          </w:tcPr>
+          <w:p>
+            <w:pPr>
+              <w:jc w:val="left"/>
               <w:rPr>
                 <w:sz w:val="24"/>
                 <w:szCs w:val="24"/>
@@ -7823,11 +7990,12 @@
       </w:tr>
       <w:tr>
         <w:trPr>
+          <w:cantSplit/>
           <w:jc w:val="center"/>
         </w:trPr>
         <w:tc>
           <w:tcPr>
-            <w:tcW w:w="3367" w:type="dxa"/>
+            <w:tcW w:w="4309" w:type="dxa"/>
             <w:tcBorders>
               <w:top w:val="single" w:sz="8" w:space="0" w:color="000000"/>
               <w:left w:val="single" w:sz="8" w:space="0" w:color="000000"/>
@@ -7855,7 +8023,7 @@
         </w:tc>
         <w:tc>
           <w:tcPr>
-            <w:tcW w:w="2248" w:type="dxa"/>
+            <w:tcW w:w="1927" w:type="dxa"/>
             <w:tcBorders>
               <w:top w:val="single" w:sz="8" w:space="0" w:color="000000"/>
               <w:left w:val="single" w:sz="8" w:space="0" w:color="000000"/>
@@ -7883,18 +8051,18 @@
         </w:tc>
         <w:tc>
           <w:tcPr>
-            <w:tcW w:w="3913" w:type="dxa"/>
-            <w:tcBorders>
-              <w:top w:val="single" w:sz="8" w:space="0" w:color="000000"/>
-              <w:left w:val="single" w:sz="8" w:space="0" w:color="000000"/>
-              <w:bottom w:val="single" w:sz="8" w:space="0" w:color="000000"/>
-              <w:right w:val="single" w:sz="8" w:space="0" w:color="000000"/>
-            </w:tcBorders>
-            <w:vAlign w:val="center"/>
-          </w:tcPr>
-          <w:p>
-            <w:pPr>
-              <w:jc w:val="both"/>
+            <w:tcW w:w="2835" w:type="dxa"/>
+            <w:tcBorders>
+              <w:top w:val="single" w:sz="8" w:space="0" w:color="000000"/>
+              <w:left w:val="single" w:sz="8" w:space="0" w:color="000000"/>
+              <w:bottom w:val="single" w:sz="8" w:space="0" w:color="000000"/>
+              <w:right w:val="single" w:sz="8" w:space="0" w:color="000000"/>
+            </w:tcBorders>
+            <w:vAlign w:val="center"/>
+          </w:tcPr>
+          <w:p>
+            <w:pPr>
+              <w:jc w:val="left"/>
               <w:rPr>
                 <w:sz w:val="24"/>
                 <w:szCs w:val="24"/>
@@ -7913,11 +8081,12 @@
       </w:tr>
       <w:tr>
         <w:trPr>
+          <w:cantSplit/>
           <w:jc w:val="center"/>
         </w:trPr>
         <w:tc>
           <w:tcPr>
-            <w:tcW w:w="3367" w:type="dxa"/>
+            <w:tcW w:w="4309" w:type="dxa"/>
             <w:tcBorders>
               <w:top w:val="single" w:sz="8" w:space="0" w:color="000000"/>
               <w:left w:val="single" w:sz="8" w:space="0" w:color="000000"/>
@@ -7945,7 +8114,7 @@
         </w:tc>
         <w:tc>
           <w:tcPr>
-            <w:tcW w:w="2248" w:type="dxa"/>
+            <w:tcW w:w="1927" w:type="dxa"/>
             <w:tcBorders>
               <w:top w:val="single" w:sz="8" w:space="0" w:color="000000"/>
               <w:left w:val="single" w:sz="8" w:space="0" w:color="000000"/>
@@ -7973,18 +8142,18 @@
         </w:tc>
         <w:tc>
           <w:tcPr>
-            <w:tcW w:w="3913" w:type="dxa"/>
-            <w:tcBorders>
-              <w:top w:val="single" w:sz="8" w:space="0" w:color="000000"/>
-              <w:left w:val="single" w:sz="8" w:space="0" w:color="000000"/>
-              <w:bottom w:val="single" w:sz="8" w:space="0" w:color="000000"/>
-              <w:right w:val="single" w:sz="8" w:space="0" w:color="000000"/>
-            </w:tcBorders>
-            <w:vAlign w:val="center"/>
-          </w:tcPr>
-          <w:p>
-            <w:pPr>
-              <w:jc w:val="both"/>
+            <w:tcW w:w="2835" w:type="dxa"/>
+            <w:tcBorders>
+              <w:top w:val="single" w:sz="8" w:space="0" w:color="000000"/>
+              <w:left w:val="single" w:sz="8" w:space="0" w:color="000000"/>
+              <w:bottom w:val="single" w:sz="8" w:space="0" w:color="000000"/>
+              <w:right w:val="single" w:sz="8" w:space="0" w:color="000000"/>
+            </w:tcBorders>
+            <w:vAlign w:val="center"/>
+          </w:tcPr>
+          <w:p>
+            <w:pPr>
+              <w:jc w:val="left"/>
               <w:rPr>
                 <w:sz w:val="24"/>
                 <w:szCs w:val="24"/>
@@ -8041,6 +8210,7 @@
     </w:p>
     <w:p>
       <w:pPr>
+        <w:keepNext/>
         <w:pBdr>
           <w:top w:val="nil"/>
           <w:left w:val="nil"/>
@@ -8073,27 +8243,30 @@
         <w:tblLook w:val="0400" w:firstRow="0" w:lastRow="0" w:firstColumn="0" w:lastColumn="0" w:noHBand="0" w:noVBand="1"/>
       </w:tblPr>
       <w:tblGrid>
-        <w:gridCol w:w="3367"/>
-        <w:gridCol w:w="2248"/>
-        <w:gridCol w:w="3913"/>
+        <w:gridCol w:w="4309"/>
+        <w:gridCol w:w="1927"/>
+        <w:gridCol w:w="2835"/>
       </w:tblGrid>
       <w:tr>
         <w:trPr>
+          <w:cantSplit/>
+          <w:tblHeader/>
           <w:jc w:val="center"/>
         </w:trPr>
         <w:tc>
           <w:tcPr>
-            <w:tcW w:w="3367" w:type="dxa"/>
-            <w:tcBorders>
-              <w:top w:val="single" w:sz="8" w:space="0" w:color="000000"/>
-              <w:left w:val="single" w:sz="8" w:space="0" w:color="000000"/>
-              <w:bottom w:val="single" w:sz="8" w:space="0" w:color="000000"/>
-              <w:right w:val="single" w:sz="8" w:space="0" w:color="000000"/>
-            </w:tcBorders>
-            <w:vAlign w:val="center"/>
-          </w:tcPr>
-          <w:p>
-            <w:pPr>
+            <w:tcW w:w="4309" w:type="dxa"/>
+            <w:tcBorders>
+              <w:top w:val="single" w:sz="8" w:space="0" w:color="000000"/>
+              <w:left w:val="single" w:sz="8" w:space="0" w:color="000000"/>
+              <w:bottom w:val="single" w:sz="8" w:space="0" w:color="000000"/>
+              <w:right w:val="single" w:sz="8" w:space="0" w:color="000000"/>
+            </w:tcBorders>
+            <w:vAlign w:val="center"/>
+          </w:tcPr>
+          <w:p>
+            <w:pPr>
+              <w:keepNext/>
               <w:jc w:val="center"/>
               <w:rPr>
                 <w:sz w:val="24"/>
@@ -8113,17 +8286,18 @@
         </w:tc>
         <w:tc>
           <w:tcPr>
-            <w:tcW w:w="2248" w:type="dxa"/>
-            <w:tcBorders>
-              <w:top w:val="single" w:sz="8" w:space="0" w:color="000000"/>
-              <w:left w:val="single" w:sz="8" w:space="0" w:color="000000"/>
-              <w:bottom w:val="single" w:sz="8" w:space="0" w:color="000000"/>
-              <w:right w:val="single" w:sz="8" w:space="0" w:color="000000"/>
-            </w:tcBorders>
-            <w:vAlign w:val="center"/>
-          </w:tcPr>
-          <w:p>
-            <w:pPr>
+            <w:tcW w:w="1927" w:type="dxa"/>
+            <w:tcBorders>
+              <w:top w:val="single" w:sz="8" w:space="0" w:color="000000"/>
+              <w:left w:val="single" w:sz="8" w:space="0" w:color="000000"/>
+              <w:bottom w:val="single" w:sz="8" w:space="0" w:color="000000"/>
+              <w:right w:val="single" w:sz="8" w:space="0" w:color="000000"/>
+            </w:tcBorders>
+            <w:vAlign w:val="center"/>
+          </w:tcPr>
+          <w:p>
+            <w:pPr>
+              <w:keepNext/>
               <w:jc w:val="center"/>
               <w:rPr>
                 <w:sz w:val="24"/>
@@ -8143,17 +8317,18 @@
         </w:tc>
         <w:tc>
           <w:tcPr>
-            <w:tcW w:w="3913" w:type="dxa"/>
-            <w:tcBorders>
-              <w:top w:val="single" w:sz="8" w:space="0" w:color="000000"/>
-              <w:left w:val="single" w:sz="8" w:space="0" w:color="000000"/>
-              <w:bottom w:val="single" w:sz="8" w:space="0" w:color="000000"/>
-              <w:right w:val="single" w:sz="8" w:space="0" w:color="000000"/>
-            </w:tcBorders>
-            <w:vAlign w:val="center"/>
-          </w:tcPr>
-          <w:p>
-            <w:pPr>
+            <w:tcW w:w="2835" w:type="dxa"/>
+            <w:tcBorders>
+              <w:top w:val="single" w:sz="8" w:space="0" w:color="000000"/>
+              <w:left w:val="single" w:sz="8" w:space="0" w:color="000000"/>
+              <w:bottom w:val="single" w:sz="8" w:space="0" w:color="000000"/>
+              <w:right w:val="single" w:sz="8" w:space="0" w:color="000000"/>
+            </w:tcBorders>
+            <w:vAlign w:val="center"/>
+          </w:tcPr>
+          <w:p>
+            <w:pPr>
+              <w:keepNext/>
               <w:jc w:val="center"/>
               <w:rPr>
                 <w:sz w:val="24"/>
@@ -8174,11 +8349,12 @@
       </w:tr>
       <w:tr>
         <w:trPr>
+          <w:cantSplit/>
           <w:jc w:val="center"/>
         </w:trPr>
         <w:tc>
           <w:tcPr>
-            <w:tcW w:w="3367" w:type="dxa"/>
+            <w:tcW w:w="4309" w:type="dxa"/>
             <w:tcBorders>
               <w:top w:val="single" w:sz="8" w:space="0" w:color="000000"/>
               <w:left w:val="single" w:sz="8" w:space="0" w:color="000000"/>
@@ -8206,7 +8382,7 @@
         </w:tc>
         <w:tc>
           <w:tcPr>
-            <w:tcW w:w="2248" w:type="dxa"/>
+            <w:tcW w:w="1927" w:type="dxa"/>
             <w:tcBorders>
               <w:top w:val="single" w:sz="8" w:space="0" w:color="000000"/>
               <w:left w:val="single" w:sz="8" w:space="0" w:color="000000"/>
@@ -8234,18 +8410,18 @@
         </w:tc>
         <w:tc>
           <w:tcPr>
-            <w:tcW w:w="3913" w:type="dxa"/>
-            <w:tcBorders>
-              <w:top w:val="single" w:sz="8" w:space="0" w:color="000000"/>
-              <w:left w:val="single" w:sz="8" w:space="0" w:color="000000"/>
-              <w:bottom w:val="single" w:sz="8" w:space="0" w:color="000000"/>
-              <w:right w:val="single" w:sz="8" w:space="0" w:color="000000"/>
-            </w:tcBorders>
-            <w:vAlign w:val="center"/>
-          </w:tcPr>
-          <w:p>
-            <w:pPr>
-              <w:jc w:val="both"/>
+            <w:tcW w:w="2835" w:type="dxa"/>
+            <w:tcBorders>
+              <w:top w:val="single" w:sz="8" w:space="0" w:color="000000"/>
+              <w:left w:val="single" w:sz="8" w:space="0" w:color="000000"/>
+              <w:bottom w:val="single" w:sz="8" w:space="0" w:color="000000"/>
+              <w:right w:val="single" w:sz="8" w:space="0" w:color="000000"/>
+            </w:tcBorders>
+            <w:vAlign w:val="center"/>
+          </w:tcPr>
+          <w:p>
+            <w:pPr>
+              <w:jc w:val="left"/>
               <w:rPr>
                 <w:sz w:val="24"/>
                 <w:szCs w:val="24"/>
@@ -8264,11 +8440,12 @@
       </w:tr>
       <w:tr>
         <w:trPr>
+          <w:cantSplit/>
           <w:jc w:val="center"/>
         </w:trPr>
         <w:tc>
           <w:tcPr>
-            <w:tcW w:w="3367" w:type="dxa"/>
+            <w:tcW w:w="4309" w:type="dxa"/>
             <w:tcBorders>
               <w:top w:val="single" w:sz="8" w:space="0" w:color="000000"/>
               <w:left w:val="single" w:sz="8" w:space="0" w:color="000000"/>
@@ -8296,7 +8473,7 @@
         </w:tc>
         <w:tc>
           <w:tcPr>
-            <w:tcW w:w="2248" w:type="dxa"/>
+            <w:tcW w:w="1927" w:type="dxa"/>
             <w:tcBorders>
               <w:top w:val="single" w:sz="8" w:space="0" w:color="000000"/>
               <w:left w:val="single" w:sz="8" w:space="0" w:color="000000"/>
@@ -8324,18 +8501,18 @@
         </w:tc>
         <w:tc>
           <w:tcPr>
-            <w:tcW w:w="3913" w:type="dxa"/>
-            <w:tcBorders>
-              <w:top w:val="single" w:sz="8" w:space="0" w:color="000000"/>
-              <w:left w:val="single" w:sz="8" w:space="0" w:color="000000"/>
-              <w:bottom w:val="single" w:sz="8" w:space="0" w:color="000000"/>
-              <w:right w:val="single" w:sz="8" w:space="0" w:color="000000"/>
-            </w:tcBorders>
-            <w:vAlign w:val="center"/>
-          </w:tcPr>
-          <w:p>
-            <w:pPr>
-              <w:jc w:val="both"/>
+            <w:tcW w:w="2835" w:type="dxa"/>
+            <w:tcBorders>
+              <w:top w:val="single" w:sz="8" w:space="0" w:color="000000"/>
+              <w:left w:val="single" w:sz="8" w:space="0" w:color="000000"/>
+              <w:bottom w:val="single" w:sz="8" w:space="0" w:color="000000"/>
+              <w:right w:val="single" w:sz="8" w:space="0" w:color="000000"/>
+            </w:tcBorders>
+            <w:vAlign w:val="center"/>
+          </w:tcPr>
+          <w:p>
+            <w:pPr>
+              <w:jc w:val="left"/>
               <w:rPr>
                 <w:sz w:val="24"/>
                 <w:szCs w:val="24"/>
@@ -8354,11 +8531,12 @@
       </w:tr>
       <w:tr>
         <w:trPr>
+          <w:cantSplit/>
           <w:jc w:val="center"/>
         </w:trPr>
         <w:tc>
           <w:tcPr>
-            <w:tcW w:w="3367" w:type="dxa"/>
+            <w:tcW w:w="4309" w:type="dxa"/>
             <w:tcBorders>
               <w:top w:val="single" w:sz="8" w:space="0" w:color="000000"/>
               <w:left w:val="single" w:sz="8" w:space="0" w:color="000000"/>
@@ -8386,7 +8564,7 @@
         </w:tc>
         <w:tc>
           <w:tcPr>
-            <w:tcW w:w="2248" w:type="dxa"/>
+            <w:tcW w:w="1927" w:type="dxa"/>
             <w:tcBorders>
               <w:top w:val="single" w:sz="8" w:space="0" w:color="000000"/>
               <w:left w:val="single" w:sz="8" w:space="0" w:color="000000"/>
@@ -8414,41 +8592,42 @@
         </w:tc>
         <w:tc>
           <w:tcPr>
-            <w:tcW w:w="3913" w:type="dxa"/>
-            <w:tcBorders>
-              <w:top w:val="single" w:sz="8" w:space="0" w:color="000000"/>
-              <w:left w:val="single" w:sz="8" w:space="0" w:color="000000"/>
-              <w:bottom w:val="single" w:sz="8" w:space="0" w:color="000000"/>
-              <w:right w:val="single" w:sz="8" w:space="0" w:color="000000"/>
-            </w:tcBorders>
-            <w:vAlign w:val="center"/>
-          </w:tcPr>
-          <w:p>
-            <w:pPr>
-              <w:jc w:val="both"/>
-              <w:rPr>
-                <w:sz w:val="24"/>
-                <w:szCs w:val="24"/>
-              </w:rPr>
-            </w:pPr>
-            <w:r>
-              <w:rPr>
-                <w:b w:val="0"/>
-                <w:sz w:val="24"/>
-                <w:szCs w:val="24"/>
-              </w:rPr>
-              <w:t>Hasil tinjauan di sheet Review Periodik</w:t>
+            <w:tcW w:w="2835" w:type="dxa"/>
+            <w:tcBorders>
+              <w:top w:val="single" w:sz="8" w:space="0" w:color="000000"/>
+              <w:left w:val="single" w:sz="8" w:space="0" w:color="000000"/>
+              <w:bottom w:val="single" w:sz="8" w:space="0" w:color="000000"/>
+              <w:right w:val="single" w:sz="8" w:space="0" w:color="000000"/>
+            </w:tcBorders>
+            <w:vAlign w:val="center"/>
+          </w:tcPr>
+          <w:p>
+            <w:pPr>
+              <w:jc w:val="left"/>
+              <w:rPr>
+                <w:sz w:val="24"/>
+                <w:szCs w:val="24"/>
+              </w:rPr>
+            </w:pPr>
+            <w:r>
+              <w:rPr>
+                <w:b w:val="0"/>
+                <w:sz w:val="24"/>
+                <w:szCs w:val="24"/>
+              </w:rPr>
+              <w:t>Hasil review di sheet Review Periodik</w:t>
             </w:r>
           </w:p>
         </w:tc>
       </w:tr>
       <w:tr>
         <w:trPr>
+          <w:cantSplit/>
           <w:jc w:val="center"/>
         </w:trPr>
         <w:tc>
           <w:tcPr>
-            <w:tcW w:w="3367" w:type="dxa"/>
+            <w:tcW w:w="4309" w:type="dxa"/>
             <w:tcBorders>
               <w:top w:val="single" w:sz="8" w:space="0" w:color="000000"/>
               <w:left w:val="single" w:sz="8" w:space="0" w:color="000000"/>
@@ -8476,7 +8655,7 @@
         </w:tc>
         <w:tc>
           <w:tcPr>
-            <w:tcW w:w="2248" w:type="dxa"/>
+            <w:tcW w:w="1927" w:type="dxa"/>
             <w:tcBorders>
               <w:top w:val="single" w:sz="8" w:space="0" w:color="000000"/>
               <w:left w:val="single" w:sz="8" w:space="0" w:color="000000"/>
@@ -8504,18 +8683,18 @@
         </w:tc>
         <w:tc>
           <w:tcPr>
-            <w:tcW w:w="3913" w:type="dxa"/>
-            <w:tcBorders>
-              <w:top w:val="single" w:sz="8" w:space="0" w:color="000000"/>
-              <w:left w:val="single" w:sz="8" w:space="0" w:color="000000"/>
-              <w:bottom w:val="single" w:sz="8" w:space="0" w:color="000000"/>
-              <w:right w:val="single" w:sz="8" w:space="0" w:color="000000"/>
-            </w:tcBorders>
-            <w:vAlign w:val="center"/>
-          </w:tcPr>
-          <w:p>
-            <w:pPr>
-              <w:jc w:val="both"/>
+            <w:tcW w:w="2835" w:type="dxa"/>
+            <w:tcBorders>
+              <w:top w:val="single" w:sz="8" w:space="0" w:color="000000"/>
+              <w:left w:val="single" w:sz="8" w:space="0" w:color="000000"/>
+              <w:bottom w:val="single" w:sz="8" w:space="0" w:color="000000"/>
+              <w:right w:val="single" w:sz="8" w:space="0" w:color="000000"/>
+            </w:tcBorders>
+            <w:vAlign w:val="center"/>
+          </w:tcPr>
+          <w:p>
+            <w:pPr>
+              <w:jc w:val="left"/>
               <w:rPr>
                 <w:sz w:val="24"/>
                 <w:szCs w:val="24"/>
@@ -8534,11 +8713,12 @@
       </w:tr>
       <w:tr>
         <w:trPr>
+          <w:cantSplit/>
           <w:jc w:val="center"/>
         </w:trPr>
         <w:tc>
           <w:tcPr>
-            <w:tcW w:w="3367" w:type="dxa"/>
+            <w:tcW w:w="4309" w:type="dxa"/>
             <w:tcBorders>
               <w:top w:val="single" w:sz="8" w:space="0" w:color="000000"/>
               <w:left w:val="single" w:sz="8" w:space="0" w:color="000000"/>
@@ -8566,7 +8746,7 @@
         </w:tc>
         <w:tc>
           <w:tcPr>
-            <w:tcW w:w="2248" w:type="dxa"/>
+            <w:tcW w:w="1927" w:type="dxa"/>
             <w:tcBorders>
               <w:top w:val="single" w:sz="8" w:space="0" w:color="000000"/>
               <w:left w:val="single" w:sz="8" w:space="0" w:color="000000"/>
@@ -8594,18 +8774,18 @@
         </w:tc>
         <w:tc>
           <w:tcPr>
-            <w:tcW w:w="3913" w:type="dxa"/>
-            <w:tcBorders>
-              <w:top w:val="single" w:sz="8" w:space="0" w:color="000000"/>
-              <w:left w:val="single" w:sz="8" w:space="0" w:color="000000"/>
-              <w:bottom w:val="single" w:sz="8" w:space="0" w:color="000000"/>
-              <w:right w:val="single" w:sz="8" w:space="0" w:color="000000"/>
-            </w:tcBorders>
-            <w:vAlign w:val="center"/>
-          </w:tcPr>
-          <w:p>
-            <w:pPr>
-              <w:jc w:val="both"/>
+            <w:tcW w:w="2835" w:type="dxa"/>
+            <w:tcBorders>
+              <w:top w:val="single" w:sz="8" w:space="0" w:color="000000"/>
+              <w:left w:val="single" w:sz="8" w:space="0" w:color="000000"/>
+              <w:bottom w:val="single" w:sz="8" w:space="0" w:color="000000"/>
+              <w:right w:val="single" w:sz="8" w:space="0" w:color="000000"/>
+            </w:tcBorders>
+            <w:vAlign w:val="center"/>
+          </w:tcPr>
+          <w:p>
+            <w:pPr>
+              <w:jc w:val="left"/>
               <w:rPr>
                 <w:sz w:val="24"/>
                 <w:szCs w:val="24"/>
@@ -8624,11 +8804,12 @@
       </w:tr>
       <w:tr>
         <w:trPr>
+          <w:cantSplit/>
           <w:jc w:val="center"/>
         </w:trPr>
         <w:tc>
           <w:tcPr>
-            <w:tcW w:w="3367" w:type="dxa"/>
+            <w:tcW w:w="4309" w:type="dxa"/>
             <w:tcBorders>
               <w:top w:val="single" w:sz="8" w:space="0" w:color="000000"/>
               <w:left w:val="single" w:sz="8" w:space="0" w:color="000000"/>
@@ -8656,7 +8837,7 @@
         </w:tc>
         <w:tc>
           <w:tcPr>
-            <w:tcW w:w="2248" w:type="dxa"/>
+            <w:tcW w:w="1927" w:type="dxa"/>
             <w:tcBorders>
               <w:top w:val="single" w:sz="8" w:space="0" w:color="000000"/>
               <w:left w:val="single" w:sz="8" w:space="0" w:color="000000"/>
@@ -8684,18 +8865,18 @@
         </w:tc>
         <w:tc>
           <w:tcPr>
-            <w:tcW w:w="3913" w:type="dxa"/>
-            <w:tcBorders>
-              <w:top w:val="single" w:sz="8" w:space="0" w:color="000000"/>
-              <w:left w:val="single" w:sz="8" w:space="0" w:color="000000"/>
-              <w:bottom w:val="single" w:sz="8" w:space="0" w:color="000000"/>
-              <w:right w:val="single" w:sz="8" w:space="0" w:color="000000"/>
-            </w:tcBorders>
-            <w:vAlign w:val="center"/>
-          </w:tcPr>
-          <w:p>
-            <w:pPr>
-              <w:jc w:val="both"/>
+            <w:tcW w:w="2835" w:type="dxa"/>
+            <w:tcBorders>
+              <w:top w:val="single" w:sz="8" w:space="0" w:color="000000"/>
+              <w:left w:val="single" w:sz="8" w:space="0" w:color="000000"/>
+              <w:bottom w:val="single" w:sz="8" w:space="0" w:color="000000"/>
+              <w:right w:val="single" w:sz="8" w:space="0" w:color="000000"/>
+            </w:tcBorders>
+            <w:vAlign w:val="center"/>
+          </w:tcPr>
+          <w:p>
+            <w:pPr>
+              <w:jc w:val="left"/>
               <w:rPr>
                 <w:sz w:val="24"/>
                 <w:szCs w:val="24"/>
@@ -8752,6 +8933,7 @@
     </w:p>
     <w:p>
       <w:pPr>
+        <w:keepNext/>
         <w:pBdr>
           <w:top w:val="nil"/>
           <w:left w:val="nil"/>
@@ -8784,27 +8966,30 @@
         <w:tblLook w:val="0400" w:firstRow="0" w:lastRow="0" w:firstColumn="0" w:lastColumn="0" w:noHBand="0" w:noVBand="1"/>
       </w:tblPr>
       <w:tblGrid>
-        <w:gridCol w:w="3367"/>
-        <w:gridCol w:w="2248"/>
-        <w:gridCol w:w="3913"/>
+        <w:gridCol w:w="4309"/>
+        <w:gridCol w:w="1927"/>
+        <w:gridCol w:w="2835"/>
       </w:tblGrid>
       <w:tr>
         <w:trPr>
+          <w:cantSplit/>
+          <w:tblHeader/>
           <w:jc w:val="center"/>
         </w:trPr>
         <w:tc>
           <w:tcPr>
-            <w:tcW w:w="3367" w:type="dxa"/>
-            <w:tcBorders>
-              <w:top w:val="single" w:sz="8" w:space="0" w:color="000000"/>
-              <w:left w:val="single" w:sz="8" w:space="0" w:color="000000"/>
-              <w:bottom w:val="single" w:sz="8" w:space="0" w:color="000000"/>
-              <w:right w:val="single" w:sz="8" w:space="0" w:color="000000"/>
-            </w:tcBorders>
-            <w:vAlign w:val="center"/>
-          </w:tcPr>
-          <w:p>
-            <w:pPr>
+            <w:tcW w:w="4309" w:type="dxa"/>
+            <w:tcBorders>
+              <w:top w:val="single" w:sz="8" w:space="0" w:color="000000"/>
+              <w:left w:val="single" w:sz="8" w:space="0" w:color="000000"/>
+              <w:bottom w:val="single" w:sz="8" w:space="0" w:color="000000"/>
+              <w:right w:val="single" w:sz="8" w:space="0" w:color="000000"/>
+            </w:tcBorders>
+            <w:vAlign w:val="center"/>
+          </w:tcPr>
+          <w:p>
+            <w:pPr>
+              <w:keepNext/>
               <w:jc w:val="center"/>
               <w:rPr>
                 <w:sz w:val="24"/>
@@ -8824,17 +9009,18 @@
         </w:tc>
         <w:tc>
           <w:tcPr>
-            <w:tcW w:w="2248" w:type="dxa"/>
-            <w:tcBorders>
-              <w:top w:val="single" w:sz="8" w:space="0" w:color="000000"/>
-              <w:left w:val="single" w:sz="8" w:space="0" w:color="000000"/>
-              <w:bottom w:val="single" w:sz="8" w:space="0" w:color="000000"/>
-              <w:right w:val="single" w:sz="8" w:space="0" w:color="000000"/>
-            </w:tcBorders>
-            <w:vAlign w:val="center"/>
-          </w:tcPr>
-          <w:p>
-            <w:pPr>
+            <w:tcW w:w="1927" w:type="dxa"/>
+            <w:tcBorders>
+              <w:top w:val="single" w:sz="8" w:space="0" w:color="000000"/>
+              <w:left w:val="single" w:sz="8" w:space="0" w:color="000000"/>
+              <w:bottom w:val="single" w:sz="8" w:space="0" w:color="000000"/>
+              <w:right w:val="single" w:sz="8" w:space="0" w:color="000000"/>
+            </w:tcBorders>
+            <w:vAlign w:val="center"/>
+          </w:tcPr>
+          <w:p>
+            <w:pPr>
+              <w:keepNext/>
               <w:jc w:val="center"/>
               <w:rPr>
                 <w:sz w:val="24"/>
@@ -8854,17 +9040,18 @@
         </w:tc>
         <w:tc>
           <w:tcPr>
-            <w:tcW w:w="3913" w:type="dxa"/>
-            <w:tcBorders>
-              <w:top w:val="single" w:sz="8" w:space="0" w:color="000000"/>
-              <w:left w:val="single" w:sz="8" w:space="0" w:color="000000"/>
-              <w:bottom w:val="single" w:sz="8" w:space="0" w:color="000000"/>
-              <w:right w:val="single" w:sz="8" w:space="0" w:color="000000"/>
-            </w:tcBorders>
-            <w:vAlign w:val="center"/>
-          </w:tcPr>
-          <w:p>
-            <w:pPr>
+            <w:tcW w:w="2835" w:type="dxa"/>
+            <w:tcBorders>
+              <w:top w:val="single" w:sz="8" w:space="0" w:color="000000"/>
+              <w:left w:val="single" w:sz="8" w:space="0" w:color="000000"/>
+              <w:bottom w:val="single" w:sz="8" w:space="0" w:color="000000"/>
+              <w:right w:val="single" w:sz="8" w:space="0" w:color="000000"/>
+            </w:tcBorders>
+            <w:vAlign w:val="center"/>
+          </w:tcPr>
+          <w:p>
+            <w:pPr>
+              <w:keepNext/>
               <w:jc w:val="center"/>
               <w:rPr>
                 <w:sz w:val="24"/>
@@ -8885,11 +9072,12 @@
       </w:tr>
       <w:tr>
         <w:trPr>
+          <w:cantSplit/>
           <w:jc w:val="center"/>
         </w:trPr>
         <w:tc>
           <w:tcPr>
-            <w:tcW w:w="3367" w:type="dxa"/>
+            <w:tcW w:w="4309" w:type="dxa"/>
             <w:tcBorders>
               <w:top w:val="single" w:sz="8" w:space="0" w:color="000000"/>
               <w:left w:val="single" w:sz="8" w:space="0" w:color="000000"/>
@@ -8917,7 +9105,7 @@
         </w:tc>
         <w:tc>
           <w:tcPr>
-            <w:tcW w:w="2248" w:type="dxa"/>
+            <w:tcW w:w="1927" w:type="dxa"/>
             <w:tcBorders>
               <w:top w:val="single" w:sz="8" w:space="0" w:color="000000"/>
               <w:left w:val="single" w:sz="8" w:space="0" w:color="000000"/>
@@ -8945,18 +9133,18 @@
         </w:tc>
         <w:tc>
           <w:tcPr>
-            <w:tcW w:w="3913" w:type="dxa"/>
-            <w:tcBorders>
-              <w:top w:val="single" w:sz="8" w:space="0" w:color="000000"/>
-              <w:left w:val="single" w:sz="8" w:space="0" w:color="000000"/>
-              <w:bottom w:val="single" w:sz="8" w:space="0" w:color="000000"/>
-              <w:right w:val="single" w:sz="8" w:space="0" w:color="000000"/>
-            </w:tcBorders>
-            <w:vAlign w:val="center"/>
-          </w:tcPr>
-          <w:p>
-            <w:pPr>
-              <w:jc w:val="both"/>
+            <w:tcW w:w="2835" w:type="dxa"/>
+            <w:tcBorders>
+              <w:top w:val="single" w:sz="8" w:space="0" w:color="000000"/>
+              <w:left w:val="single" w:sz="8" w:space="0" w:color="000000"/>
+              <w:bottom w:val="single" w:sz="8" w:space="0" w:color="000000"/>
+              <w:right w:val="single" w:sz="8" w:space="0" w:color="000000"/>
+            </w:tcBorders>
+            <w:vAlign w:val="center"/>
+          </w:tcPr>
+          <w:p>
+            <w:pPr>
+              <w:jc w:val="left"/>
               <w:rPr>
                 <w:sz w:val="24"/>
                 <w:szCs w:val="24"/>
@@ -8975,39 +9163,40 @@
       </w:tr>
       <w:tr>
         <w:trPr>
+          <w:cantSplit/>
           <w:jc w:val="center"/>
         </w:trPr>
         <w:tc>
           <w:tcPr>
-            <w:tcW w:w="3367" w:type="dxa"/>
-            <w:tcBorders>
-              <w:top w:val="single" w:sz="8" w:space="0" w:color="000000"/>
-              <w:left w:val="single" w:sz="8" w:space="0" w:color="000000"/>
-              <w:bottom w:val="single" w:sz="8" w:space="0" w:color="000000"/>
-              <w:right w:val="single" w:sz="8" w:space="0" w:color="000000"/>
-            </w:tcBorders>
-            <w:vAlign w:val="center"/>
-          </w:tcPr>
-          <w:p>
-            <w:pPr>
-              <w:rPr>
-                <w:sz w:val="24"/>
-                <w:szCs w:val="24"/>
-              </w:rPr>
-            </w:pPr>
-            <w:r>
-              <w:rPr>
-                <w:b w:val="0"/>
-                <w:sz w:val="24"/>
-                <w:szCs w:val="24"/>
-              </w:rPr>
-              <w:t>2. Kerjakan akses privileged di production pelanggan dalam kerangka change request SNX-OPS-SOP-02.</w:t>
-            </w:r>
-          </w:p>
-        </w:tc>
-        <w:tc>
-          <w:tcPr>
-            <w:tcW w:w="2248" w:type="dxa"/>
+            <w:tcW w:w="4309" w:type="dxa"/>
+            <w:tcBorders>
+              <w:top w:val="single" w:sz="8" w:space="0" w:color="000000"/>
+              <w:left w:val="single" w:sz="8" w:space="0" w:color="000000"/>
+              <w:bottom w:val="single" w:sz="8" w:space="0" w:color="000000"/>
+              <w:right w:val="single" w:sz="8" w:space="0" w:color="000000"/>
+            </w:tcBorders>
+            <w:vAlign w:val="center"/>
+          </w:tcPr>
+          <w:p>
+            <w:pPr>
+              <w:rPr>
+                <w:sz w:val="24"/>
+                <w:szCs w:val="24"/>
+              </w:rPr>
+            </w:pPr>
+            <w:r>
+              <w:rPr>
+                <w:b w:val="0"/>
+                <w:sz w:val="24"/>
+                <w:szCs w:val="24"/>
+              </w:rPr>
+              <w:t>2. Jalankan akses privileged di production pelanggan dalam change request sesuai SNX-OPS-SOP-02.</w:t>
+            </w:r>
+          </w:p>
+        </w:tc>
+        <w:tc>
+          <w:tcPr>
+            <w:tcW w:w="1927" w:type="dxa"/>
             <w:tcBorders>
               <w:top w:val="single" w:sz="8" w:space="0" w:color="000000"/>
               <w:left w:val="single" w:sz="8" w:space="0" w:color="000000"/>
@@ -9035,18 +9224,18 @@
         </w:tc>
         <w:tc>
           <w:tcPr>
-            <w:tcW w:w="3913" w:type="dxa"/>
-            <w:tcBorders>
-              <w:top w:val="single" w:sz="8" w:space="0" w:color="000000"/>
-              <w:left w:val="single" w:sz="8" w:space="0" w:color="000000"/>
-              <w:bottom w:val="single" w:sz="8" w:space="0" w:color="000000"/>
-              <w:right w:val="single" w:sz="8" w:space="0" w:color="000000"/>
-            </w:tcBorders>
-            <w:vAlign w:val="center"/>
-          </w:tcPr>
-          <w:p>
-            <w:pPr>
-              <w:jc w:val="both"/>
+            <w:tcW w:w="2835" w:type="dxa"/>
+            <w:tcBorders>
+              <w:top w:val="single" w:sz="8" w:space="0" w:color="000000"/>
+              <w:left w:val="single" w:sz="8" w:space="0" w:color="000000"/>
+              <w:bottom w:val="single" w:sz="8" w:space="0" w:color="000000"/>
+              <w:right w:val="single" w:sz="8" w:space="0" w:color="000000"/>
+            </w:tcBorders>
+            <w:vAlign w:val="center"/>
+          </w:tcPr>
+          <w:p>
+            <w:pPr>
+              <w:jc w:val="left"/>
               <w:rPr>
                 <w:sz w:val="24"/>
                 <w:szCs w:val="24"/>
@@ -9065,11 +9254,12 @@
       </w:tr>
       <w:tr>
         <w:trPr>
+          <w:cantSplit/>
           <w:jc w:val="center"/>
         </w:trPr>
         <w:tc>
           <w:tcPr>
-            <w:tcW w:w="3367" w:type="dxa"/>
+            <w:tcW w:w="4309" w:type="dxa"/>
             <w:tcBorders>
               <w:top w:val="single" w:sz="8" w:space="0" w:color="000000"/>
               <w:left w:val="single" w:sz="8" w:space="0" w:color="000000"/>
@@ -9097,7 +9287,7 @@
         </w:tc>
         <w:tc>
           <w:tcPr>
-            <w:tcW w:w="2248" w:type="dxa"/>
+            <w:tcW w:w="1927" w:type="dxa"/>
             <w:tcBorders>
               <w:top w:val="single" w:sz="8" w:space="0" w:color="000000"/>
               <w:left w:val="single" w:sz="8" w:space="0" w:color="000000"/>
@@ -9125,18 +9315,18 @@
         </w:tc>
         <w:tc>
           <w:tcPr>
-            <w:tcW w:w="3913" w:type="dxa"/>
-            <w:tcBorders>
-              <w:top w:val="single" w:sz="8" w:space="0" w:color="000000"/>
-              <w:left w:val="single" w:sz="8" w:space="0" w:color="000000"/>
-              <w:bottom w:val="single" w:sz="8" w:space="0" w:color="000000"/>
-              <w:right w:val="single" w:sz="8" w:space="0" w:color="000000"/>
-            </w:tcBorders>
-            <w:vAlign w:val="center"/>
-          </w:tcPr>
-          <w:p>
-            <w:pPr>
-              <w:jc w:val="both"/>
+            <w:tcW w:w="2835" w:type="dxa"/>
+            <w:tcBorders>
+              <w:top w:val="single" w:sz="8" w:space="0" w:color="000000"/>
+              <w:left w:val="single" w:sz="8" w:space="0" w:color="000000"/>
+              <w:bottom w:val="single" w:sz="8" w:space="0" w:color="000000"/>
+              <w:right w:val="single" w:sz="8" w:space="0" w:color="000000"/>
+            </w:tcBorders>
+            <w:vAlign w:val="center"/>
+          </w:tcPr>
+          <w:p>
+            <w:pPr>
+              <w:jc w:val="left"/>
               <w:rPr>
                 <w:sz w:val="24"/>
                 <w:szCs w:val="24"/>
@@ -9309,6 +9499,7 @@
     <w:p>
       <w:pPr>
         <w:pStyle w:val="Heading1"/>
+        <w:keepNext/>
         <w:numPr>
           <w:ilvl w:val="0"/>
           <w:numId w:val="7"/>
@@ -9337,6 +9528,8 @@
       </w:tblGrid>
       <w:tr>
         <w:trPr>
+          <w:cantSplit/>
+          <w:tblHeader/>
           <w:jc w:val="center"/>
         </w:trPr>
         <w:tc>
@@ -9352,6 +9545,7 @@
           </w:tcPr>
           <w:p>
             <w:pPr>
+              <w:keepNext/>
               <w:jc w:val="center"/>
               <w:rPr>
                 <w:sz w:val="24"/>
@@ -9382,6 +9576,7 @@
           </w:tcPr>
           <w:p>
             <w:pPr>
+              <w:keepNext/>
               <w:jc w:val="center"/>
               <w:rPr>
                 <w:sz w:val="24"/>
@@ -9412,6 +9607,7 @@
           </w:tcPr>
           <w:p>
             <w:pPr>
+              <w:keepNext/>
               <w:jc w:val="center"/>
               <w:rPr>
                 <w:sz w:val="24"/>
@@ -9432,6 +9628,7 @@
       </w:tr>
       <w:tr>
         <w:trPr>
+          <w:cantSplit/>
           <w:jc w:val="center"/>
         </w:trPr>
         <w:tc>
@@ -9503,7 +9700,7 @@
           </w:tcPr>
           <w:p>
             <w:pPr>
-              <w:jc w:val="both"/>
+              <w:jc w:val="left"/>
               <w:rPr>
                 <w:sz w:val="24"/>
                 <w:szCs w:val="24"/>
@@ -9522,6 +9719,7 @@
       </w:tr>
       <w:tr>
         <w:trPr>
+          <w:cantSplit/>
           <w:jc w:val="center"/>
         </w:trPr>
         <w:tc>
@@ -9593,25 +9791,26 @@
           </w:tcPr>
           <w:p>
             <w:pPr>
-              <w:jc w:val="both"/>
-              <w:rPr>
-                <w:sz w:val="24"/>
-                <w:szCs w:val="24"/>
-              </w:rPr>
-            </w:pPr>
-            <w:r>
-              <w:rPr>
-                <w:b w:val="0"/>
-                <w:sz w:val="24"/>
-                <w:szCs w:val="24"/>
-              </w:rPr>
-              <w:t>2 hari kerja sesudah atasan mengonfirmasi (USULAN)</w:t>
+              <w:jc w:val="left"/>
+              <w:rPr>
+                <w:sz w:val="24"/>
+                <w:szCs w:val="24"/>
+              </w:rPr>
+            </w:pPr>
+            <w:r>
+              <w:rPr>
+                <w:b w:val="0"/>
+                <w:sz w:val="24"/>
+                <w:szCs w:val="24"/>
+              </w:rPr>
+              <w:t>2 hari kerja setelah atasan mengonfirmasi (USULAN)</w:t>
             </w:r>
           </w:p>
         </w:tc>
       </w:tr>
       <w:tr>
         <w:trPr>
+          <w:cantSplit/>
           <w:jc w:val="center"/>
         </w:trPr>
         <w:tc>
@@ -9638,7 +9837,7 @@
                 <w:sz w:val="24"/>
                 <w:szCs w:val="24"/>
               </w:rPr>
-              <w:t>Pembuatan akun sesudah approval</w:t>
+              <w:t>Pembuatan akun setelah approval</w:t>
             </w:r>
           </w:p>
         </w:tc>
@@ -9683,7 +9882,7 @@
           </w:tcPr>
           <w:p>
             <w:pPr>
-              <w:jc w:val="both"/>
+              <w:jc w:val="left"/>
               <w:rPr>
                 <w:sz w:val="24"/>
                 <w:szCs w:val="24"/>
@@ -9702,6 +9901,7 @@
       </w:tr>
       <w:tr>
         <w:trPr>
+          <w:cantSplit/>
           <w:jc w:val="center"/>
         </w:trPr>
         <w:tc>
@@ -9773,7 +9973,7 @@
           </w:tcPr>
           <w:p>
             <w:pPr>
-              <w:jc w:val="both"/>
+              <w:jc w:val="left"/>
               <w:rPr>
                 <w:sz w:val="24"/>
                 <w:szCs w:val="24"/>
@@ -9792,6 +9992,7 @@
       </w:tr>
       <w:tr>
         <w:trPr>
+          <w:cantSplit/>
           <w:jc w:val="center"/>
         </w:trPr>
         <w:tc>
@@ -9863,7 +10064,7 @@
           </w:tcPr>
           <w:p>
             <w:pPr>
-              <w:jc w:val="both"/>
+              <w:jc w:val="left"/>
               <w:rPr>
                 <w:sz w:val="24"/>
                 <w:szCs w:val="24"/>
@@ -9882,6 +10083,7 @@
       </w:tr>
       <w:tr>
         <w:trPr>
+          <w:cantSplit/>
           <w:jc w:val="center"/>
         </w:trPr>
         <w:tc>
@@ -9953,25 +10155,26 @@
           </w:tcPr>
           <w:p>
             <w:pPr>
-              <w:jc w:val="both"/>
-              <w:rPr>
-                <w:sz w:val="24"/>
-                <w:szCs w:val="24"/>
-              </w:rPr>
-            </w:pPr>
-            <w:r>
-              <w:rPr>
-                <w:b w:val="0"/>
-                <w:sz w:val="24"/>
-                <w:szCs w:val="24"/>
-              </w:rPr>
-              <w:t>Paling lambat hari terakhir kerja; mendadak: segera; target 100%</w:t>
+              <w:jc w:val="left"/>
+              <w:rPr>
+                <w:sz w:val="24"/>
+                <w:szCs w:val="24"/>
+              </w:rPr>
+            </w:pPr>
+            <w:r>
+              <w:rPr>
+                <w:b w:val="0"/>
+                <w:sz w:val="24"/>
+                <w:szCs w:val="24"/>
+              </w:rPr>
+              <w:t>Paling lambat hari terakhir kerja; pemberhentian mendadak: segera; target 100%</w:t>
             </w:r>
           </w:p>
         </w:tc>
       </w:tr>
       <w:tr>
         <w:trPr>
+          <w:cantSplit/>
           <w:jc w:val="center"/>
         </w:trPr>
         <w:tc>
@@ -10043,7 +10246,7 @@
           </w:tcPr>
           <w:p>
             <w:pPr>
-              <w:jc w:val="both"/>
+              <w:jc w:val="left"/>
               <w:rPr>
                 <w:sz w:val="24"/>
                 <w:szCs w:val="24"/>
@@ -10062,6 +10265,7 @@
       </w:tr>
       <w:tr>
         <w:trPr>
+          <w:cantSplit/>
           <w:jc w:val="center"/>
         </w:trPr>
         <w:tc>
@@ -10133,7 +10337,7 @@
           </w:tcPr>
           <w:p>
             <w:pPr>
-              <w:jc w:val="both"/>
+              <w:jc w:val="left"/>
               <w:rPr>
                 <w:sz w:val="24"/>
                 <w:szCs w:val="24"/>
@@ -10152,6 +10356,7 @@
       </w:tr>
       <w:tr>
         <w:trPr>
+          <w:cantSplit/>
           <w:jc w:val="center"/>
         </w:trPr>
         <w:tc>
@@ -10223,7 +10428,7 @@
           </w:tcPr>
           <w:p>
             <w:pPr>
-              <w:jc w:val="both"/>
+              <w:jc w:val="left"/>
               <w:rPr>
                 <w:sz w:val="24"/>
                 <w:szCs w:val="24"/>
@@ -10242,6 +10447,7 @@
       </w:tr>
       <w:tr>
         <w:trPr>
+          <w:cantSplit/>
           <w:jc w:val="center"/>
         </w:trPr>
         <w:tc>
@@ -10313,7 +10519,7 @@
           </w:tcPr>
           <w:p>
             <w:pPr>
-              <w:jc w:val="both"/>
+              <w:jc w:val="left"/>
               <w:rPr>
                 <w:sz w:val="24"/>
                 <w:szCs w:val="24"/>
@@ -10332,6 +10538,7 @@
       </w:tr>
       <w:tr>
         <w:trPr>
+          <w:cantSplit/>
           <w:jc w:val="center"/>
         </w:trPr>
         <w:tc>
@@ -10403,7 +10610,7 @@
           </w:tcPr>
           <w:p>
             <w:pPr>
-              <w:jc w:val="both"/>
+              <w:jc w:val="left"/>
               <w:rPr>
                 <w:sz w:val="24"/>
                 <w:szCs w:val="24"/>
@@ -10422,6 +10629,7 @@
       </w:tr>
       <w:tr>
         <w:trPr>
+          <w:cantSplit/>
           <w:jc w:val="center"/>
         </w:trPr>
         <w:tc>
@@ -10493,7 +10701,7 @@
           </w:tcPr>
           <w:p>
             <w:pPr>
-              <w:jc w:val="both"/>
+              <w:jc w:val="left"/>
               <w:rPr>
                 <w:sz w:val="24"/>
                 <w:szCs w:val="24"/>
@@ -10522,6 +10730,7 @@
     <w:p>
       <w:pPr>
         <w:pStyle w:val="Heading1"/>
+        <w:keepNext/>
         <w:numPr>
           <w:ilvl w:val="0"/>
           <w:numId w:val="7"/>
@@ -10554,6 +10763,10 @@
         <w:gridCol w:w="6765"/>
       </w:tblGrid>
       <w:tr>
+        <w:trPr>
+          <w:cantSplit/>
+          <w:tblHeader/>
+        </w:trPr>
         <w:tc>
           <w:tcPr>
             <w:tcW w:w="2745" w:type="dxa"/>
@@ -10566,6 +10779,7 @@
           </w:tcPr>
           <w:p>
             <w:pPr>
+              <w:keepNext/>
               <w:spacing w:after="120" w:line="252" w:lineRule="auto"/>
               <w:rPr>
                 <w:sz w:val="24"/>
@@ -10594,8 +10808,9 @@
           </w:tcPr>
           <w:p>
             <w:pPr>
+              <w:keepNext/>
               <w:spacing w:after="120" w:line="252" w:lineRule="auto"/>
-              <w:jc w:val="both"/>
+              <w:jc w:val="left"/>
               <w:rPr>
                 <w:sz w:val="24"/>
                 <w:szCs w:val="24"/>
@@ -10613,6 +10828,9 @@
         </w:tc>
       </w:tr>
       <w:tr>
+        <w:trPr>
+          <w:cantSplit/>
+        </w:trPr>
         <w:tc>
           <w:tcPr>
             <w:tcW w:w="2745" w:type="dxa"/>
@@ -10654,7 +10872,7 @@
           <w:p>
             <w:pPr>
               <w:spacing w:after="120" w:line="252" w:lineRule="auto"/>
-              <w:jc w:val="both"/>
+              <w:jc w:val="left"/>
               <w:rPr>
                 <w:sz w:val="24"/>
                 <w:szCs w:val="24"/>
@@ -10672,6 +10890,9 @@
         </w:tc>
       </w:tr>
       <w:tr>
+        <w:trPr>
+          <w:cantSplit/>
+        </w:trPr>
         <w:tc>
           <w:tcPr>
             <w:tcW w:w="2745" w:type="dxa"/>
@@ -10713,24 +10934,27 @@
           <w:p>
             <w:pPr>
               <w:spacing w:after="120" w:line="252" w:lineRule="auto"/>
-              <w:jc w:val="both"/>
-              <w:rPr>
-                <w:sz w:val="24"/>
-                <w:szCs w:val="24"/>
-              </w:rPr>
-            </w:pPr>
-            <w:r>
-              <w:rPr>
-                <w:b w:val="0"/>
-                <w:sz w:val="24"/>
-                <w:szCs w:val="24"/>
-              </w:rPr>
-              <w:t>Administrator sistem membuat akun sesudah Head of Operation dan pelanggan menyetujui (butir 6.1).</w:t>
+              <w:jc w:val="left"/>
+              <w:rPr>
+                <w:sz w:val="24"/>
+                <w:szCs w:val="24"/>
+              </w:rPr>
+            </w:pPr>
+            <w:r>
+              <w:rPr>
+                <w:b w:val="0"/>
+                <w:sz w:val="24"/>
+                <w:szCs w:val="24"/>
+              </w:rPr>
+              <w:t>Administrator sistem membuat akun setelah Head of Operation dan pelanggan menyetujui (butir 6.1).</w:t>
             </w:r>
           </w:p>
         </w:tc>
       </w:tr>
       <w:tr>
+        <w:trPr>
+          <w:cantSplit/>
+        </w:trPr>
         <w:tc>
           <w:tcPr>
             <w:tcW w:w="2745" w:type="dxa"/>
@@ -10772,7 +10996,7 @@
           <w:p>
             <w:pPr>
               <w:spacing w:after="120" w:line="252" w:lineRule="auto"/>
-              <w:jc w:val="both"/>
+              <w:jc w:val="left"/>
               <w:rPr>
                 <w:sz w:val="24"/>
                 <w:szCs w:val="24"/>
@@ -10790,6 +11014,9 @@
         </w:tc>
       </w:tr>
       <w:tr>
+        <w:trPr>
+          <w:cantSplit/>
+        </w:trPr>
         <w:tc>
           <w:tcPr>
             <w:tcW w:w="2745" w:type="dxa"/>
@@ -10814,7 +11041,7 @@
                 <w:sz w:val="24"/>
                 <w:szCs w:val="24"/>
               </w:rPr>
-              <w:t>Sistem internal tidak mendukung akses privileged lewat Jumphost</w:t>
+              <w:t>Sistem internal tidak mendukung akses privileged melalui Jumphost</w:t>
             </w:r>
           </w:p>
         </w:tc>
@@ -10831,7 +11058,7 @@
           <w:p>
             <w:pPr>
               <w:spacing w:after="120" w:line="252" w:lineRule="auto"/>
-              <w:jc w:val="both"/>
+              <w:jc w:val="left"/>
               <w:rPr>
                 <w:sz w:val="24"/>
                 <w:szCs w:val="24"/>
@@ -10849,6 +11076,9 @@
         </w:tc>
       </w:tr>
       <w:tr>
+        <w:trPr>
+          <w:cantSplit/>
+        </w:trPr>
         <w:tc>
           <w:tcPr>
             <w:tcW w:w="2745" w:type="dxa"/>
@@ -10890,24 +11120,27 @@
           <w:p>
             <w:pPr>
               <w:spacing w:after="120" w:line="252" w:lineRule="auto"/>
-              <w:jc w:val="both"/>
-              <w:rPr>
-                <w:sz w:val="24"/>
-                <w:szCs w:val="24"/>
-              </w:rPr>
-            </w:pPr>
-            <w:r>
-              <w:rPr>
-                <w:b w:val="0"/>
-                <w:sz w:val="24"/>
-                <w:szCs w:val="24"/>
-              </w:rPr>
-              <w:t>Akun bersama dilarang. Pengecualian hanya akun break-glass di password manager, dan Pengguna akun mencatat setiap pemakaiannya.</w:t>
+              <w:jc w:val="left"/>
+              <w:rPr>
+                <w:sz w:val="24"/>
+                <w:szCs w:val="24"/>
+              </w:rPr>
+            </w:pPr>
+            <w:r>
+              <w:rPr>
+                <w:b w:val="0"/>
+                <w:sz w:val="24"/>
+                <w:szCs w:val="24"/>
+              </w:rPr>
+              <w:t>Akun bersama dilarang. Pengecualian hanya akun break-glass di password manager. Pengguna akun mencatat setiap pemakaiannya.</w:t>
             </w:r>
           </w:p>
         </w:tc>
       </w:tr>
       <w:tr>
+        <w:trPr>
+          <w:cantSplit/>
+        </w:trPr>
         <w:tc>
           <w:tcPr>
             <w:tcW w:w="2745" w:type="dxa"/>
@@ -10949,7 +11182,7 @@
           <w:p>
             <w:pPr>
               <w:spacing w:after="120" w:line="252" w:lineRule="auto"/>
-              <w:jc w:val="both"/>
+              <w:jc w:val="left"/>
               <w:rPr>
                 <w:sz w:val="24"/>
                 <w:szCs w:val="24"/>
@@ -11020,7 +11253,7 @@
           <w:sz w:val="24"/>
           <w:szCs w:val="24"/>
         </w:rPr>
-        <w:t xml:space="preserve">ISMS Coordinator memantau kepatuhan terhadap SOP ini lewat pelaksanaan review akses dan tindak lanjut temuannya.</w:t>
+        <w:t xml:space="preserve">ISMS Coordinator memantau kepatuhan terhadap SOP ini melalui pelaksanaan review akses dan tindak lanjut temuannya.</w:t>
       </w:r>
     </w:p>
     <w:p>
@@ -11096,6 +11329,7 @@
     </w:p>
     <w:p>
       <w:pPr>
+        <w:keepNext/>
         <w:pBdr>
           <w:top w:val="nil"/>
           <w:left w:val="nil"/>
@@ -11142,6 +11376,8 @@
       </w:tblGrid>
       <w:tr>
         <w:trPr>
+          <w:cantSplit/>
+          <w:tblHeader/>
           <w:jc w:val="center"/>
         </w:trPr>
         <w:tc>
@@ -11151,6 +11387,7 @@
           </w:tcPr>
           <w:p>
             <w:pPr>
+              <w:keepNext/>
               <w:jc w:val="center"/>
               <w:rPr>
                 <w:sz w:val="24"/>
@@ -11175,6 +11412,7 @@
           </w:tcPr>
           <w:p>
             <w:pPr>
+              <w:keepNext/>
               <w:jc w:val="center"/>
               <w:rPr>
                 <w:sz w:val="24"/>
@@ -11195,6 +11433,7 @@
       </w:tr>
       <w:tr>
         <w:trPr>
+          <w:cantSplit/>
           <w:jc w:val="center"/>
         </w:trPr>
         <w:tc>
@@ -11244,6 +11483,7 @@
       </w:tr>
       <w:tr>
         <w:trPr>
+          <w:cantSplit/>
           <w:jc w:val="center"/>
         </w:trPr>
         <w:tc>
@@ -11293,6 +11533,7 @@
       </w:tr>
       <w:tr>
         <w:trPr>
+          <w:cantSplit/>
           <w:jc w:val="center"/>
         </w:trPr>
         <w:tc>
@@ -11342,6 +11583,7 @@
       </w:tr>
       <w:tr>
         <w:trPr>
+          <w:cantSplit/>
           <w:jc w:val="center"/>
         </w:trPr>
         <w:tc>
@@ -11391,6 +11633,7 @@
       </w:tr>
       <w:tr>
         <w:trPr>
+          <w:cantSplit/>
           <w:jc w:val="center"/>
         </w:trPr>
         <w:tc>
@@ -11440,6 +11683,7 @@
       </w:tr>
       <w:tr>
         <w:trPr>
+          <w:cantSplit/>
           <w:jc w:val="center"/>
         </w:trPr>
         <w:tc>
@@ -11489,6 +11733,7 @@
       </w:tr>
       <w:tr>
         <w:trPr>
+          <w:cantSplit/>
           <w:jc w:val="center"/>
         </w:trPr>
         <w:tc>
@@ -11538,6 +11783,7 @@
       </w:tr>
       <w:tr>
         <w:trPr>
+          <w:cantSplit/>
           <w:jc w:val="center"/>
         </w:trPr>
         <w:tc>
@@ -11587,6 +11833,7 @@
       </w:tr>
       <w:tr>
         <w:trPr>
+          <w:cantSplit/>
           <w:jc w:val="center"/>
         </w:trPr>
         <w:tc>
@@ -11637,6 +11884,7 @@
     </w:tbl>
     <w:p>
       <w:pPr>
+        <w:keepNext/>
         <w:pBdr>
           <w:top w:val="nil"/>
           <w:left w:val="nil"/>
@@ -11676,6 +11924,8 @@
       </w:tblGrid>
       <w:tr>
         <w:trPr>
+          <w:cantSplit/>
+          <w:tblHeader/>
           <w:jc w:val="center"/>
         </w:trPr>
         <w:tc>
@@ -11691,6 +11941,7 @@
           </w:tcPr>
           <w:p>
             <w:pPr>
+              <w:keepNext/>
               <w:jc w:val="center"/>
               <w:rPr>
                 <w:sz w:val="24"/>
@@ -11721,6 +11972,7 @@
           </w:tcPr>
           <w:p>
             <w:pPr>
+              <w:keepNext/>
               <w:jc w:val="center"/>
               <w:rPr>
                 <w:sz w:val="24"/>
@@ -11751,6 +12003,7 @@
           </w:tcPr>
           <w:p>
             <w:pPr>
+              <w:keepNext/>
               <w:jc w:val="center"/>
               <w:rPr>
                 <w:sz w:val="24"/>
@@ -11771,6 +12024,7 @@
       </w:tr>
       <w:tr>
         <w:trPr>
+          <w:cantSplit/>
           <w:jc w:val="center"/>
         </w:trPr>
         <w:tc>
@@ -11842,7 +12096,7 @@
           </w:tcPr>
           <w:p>
             <w:pPr>
-              <w:jc w:val="both"/>
+              <w:jc w:val="left"/>
               <w:rPr>
                 <w:sz w:val="24"/>
                 <w:szCs w:val="24"/>
@@ -11861,6 +12115,7 @@
       </w:tr>
       <w:tr>
         <w:trPr>
+          <w:cantSplit/>
           <w:jc w:val="center"/>
         </w:trPr>
         <w:tc>
@@ -11887,7 +12142,7 @@
                 <w:sz w:val="24"/>
                 <w:szCs w:val="24"/>
               </w:rPr>
-              <w:t>Tiket permintaan akses</w:t>
+              <w:t>Ticket permintaan akses</w:t>
             </w:r>
           </w:p>
         </w:tc>
@@ -11932,7 +12187,7 @@
           </w:tcPr>
           <w:p>
             <w:pPr>
-              <w:jc w:val="both"/>
+              <w:jc w:val="left"/>
               <w:rPr>
                 <w:sz w:val="24"/>
                 <w:szCs w:val="24"/>
@@ -11951,6 +12206,7 @@
       </w:tr>
       <w:tr>
         <w:trPr>
+          <w:cantSplit/>
           <w:jc w:val="center"/>
         </w:trPr>
         <w:tc>
@@ -12022,7 +12278,7 @@
           </w:tcPr>
           <w:p>
             <w:pPr>
-              <w:jc w:val="both"/>
+              <w:jc w:val="left"/>
               <w:rPr>
                 <w:sz w:val="24"/>
                 <w:szCs w:val="24"/>
@@ -12041,6 +12297,7 @@
       </w:tr>
       <w:tr>
         <w:trPr>
+          <w:cantSplit/>
           <w:jc w:val="center"/>
         </w:trPr>
         <w:tc>
@@ -12112,7 +12369,7 @@
           </w:tcPr>
           <w:p>
             <w:pPr>
-              <w:jc w:val="both"/>
+              <w:jc w:val="left"/>
               <w:rPr>
                 <w:sz w:val="24"/>
                 <w:szCs w:val="24"/>

</xml_diff>